<commit_message>
After Fundamental Changes and additions
</commit_message>
<xml_diff>
--- a/Computer Programming -Challenges,Concepts, Approaches & Implementations by ADSkeptiK.docx
+++ b/Computer Programming -Challenges,Concepts, Approaches & Implementations by ADSkeptiK.docx
@@ -1700,113 +1700,205 @@
     </w:p>
     <w:p>
       <w:pPr>
+        <w:rPr>
+          <w:u w:val="single"/>
+        </w:rPr>
+      </w:pPr>
+      <w:r>
+        <w:rPr>
+          <w:u w:val="single"/>
+        </w:rPr>
+        <w:lastRenderedPageBreak/>
+        <w:t>Keep in mind we have abstractions in each layer but only the abstraction</w:t>
+      </w:r>
+      <w:r>
+        <w:rPr>
+          <w:u w:val="single"/>
+        </w:rPr>
+        <w:t>(</w:t>
+      </w:r>
+      <w:r>
+        <w:rPr>
+          <w:u w:val="single"/>
+        </w:rPr>
+        <w:t>s</w:t>
+      </w:r>
+      <w:r>
+        <w:rPr>
+          <w:u w:val="single"/>
+        </w:rPr>
+        <w:t>)</w:t>
+      </w:r>
+      <w:r>
+        <w:rPr>
+          <w:u w:val="single"/>
+        </w:rPr>
+        <w:t xml:space="preserve"> that </w:t>
+      </w:r>
+      <w:r>
+        <w:rPr>
+          <w:u w:val="single"/>
+        </w:rPr>
+        <w:t>implemented</w:t>
+      </w:r>
+      <w:r>
+        <w:rPr>
+          <w:u w:val="single"/>
+        </w:rPr>
+        <w:t xml:space="preserve"> specifically for programming </w:t>
+      </w:r>
+      <w:r>
+        <w:rPr>
+          <w:u w:val="single"/>
+        </w:rPr>
+        <w:t xml:space="preserve">the </w:t>
+      </w:r>
+      <w:r>
+        <w:rPr>
+          <w:u w:val="single"/>
+        </w:rPr>
+        <w:t>component</w:t>
+      </w:r>
+      <w:r>
+        <w:rPr>
+          <w:u w:val="single"/>
+        </w:rPr>
+        <w:t>(s)</w:t>
+      </w:r>
+      <w:r>
+        <w:rPr>
+          <w:u w:val="single"/>
+        </w:rPr>
+        <w:t xml:space="preserve"> </w:t>
+      </w:r>
+      <w:r>
+        <w:rPr>
+          <w:u w:val="single"/>
+        </w:rPr>
+        <w:t>is</w:t>
+      </w:r>
+      <w:r>
+        <w:rPr>
+          <w:u w:val="single"/>
+        </w:rPr>
+        <w:t xml:space="preserve"> called an API.</w:t>
+      </w:r>
+    </w:p>
+    <w:p>
+      <w:pPr>
         <w:pStyle w:val="Heading3"/>
       </w:pPr>
       <w:r>
+        <w:t>Comp</w:t>
+      </w:r>
+      <w:r>
+        <w:t>uters</w:t>
+      </w:r>
+    </w:p>
+    <w:p>
+      <w:r>
+        <w:t xml:space="preserve">Any tool </w:t>
+      </w:r>
+      <w:r>
+        <w:t xml:space="preserve">flexible enough to handle any </w:t>
+      </w:r>
+      <w:r>
+        <w:t>level</w:t>
+      </w:r>
+      <w:r>
+        <w:t>4</w:t>
+      </w:r>
+      <w:r>
+        <w:t xml:space="preserve"> of computing could be regarded as computer</w:t>
+      </w:r>
+      <w:r>
+        <w:t xml:space="preserve">. Obviously the scales, flexibility, speed and etc sensibly do differ from a computer to another based on which purpose or purposes they are prioritizing but ultimately, there are certain logically necessary conceptual roles that MUST </w:t>
+      </w:r>
+      <w:r>
+        <w:t xml:space="preserve">and do exist </w:t>
+      </w:r>
+      <w:r>
+        <w:t>in any computer</w:t>
+      </w:r>
+      <w:r>
+        <w:t>:</w:t>
+      </w:r>
+    </w:p>
+    <w:p>
+      <w:r>
+        <w:t>- Some piece</w:t>
+      </w:r>
+      <w:r>
+        <w:t>(s)</w:t>
+      </w:r>
+      <w:r>
+        <w:t xml:space="preserve"> of hardware to keep track of computations and data.</w:t>
+      </w:r>
+    </w:p>
+    <w:p>
+      <w:r>
+        <w:t>- Some piece</w:t>
+      </w:r>
+      <w:r>
+        <w:t>(s)</w:t>
+      </w:r>
+      <w:r>
+        <w:t xml:space="preserve"> of hardware to manage the data.</w:t>
+      </w:r>
+    </w:p>
+    <w:p>
+      <w:r>
+        <w:t>-</w:t>
+      </w:r>
+      <w:r>
+        <w:t xml:space="preserve"> Some </w:t>
+      </w:r>
+      <w:r>
+        <w:t>pieces(s) of hardware</w:t>
+      </w:r>
+      <w:r>
+        <w:t xml:space="preserve"> to communicate with it’s user.</w:t>
+      </w:r>
+    </w:p>
+    <w:p>
+      <w:r>
+        <w:t>These could exist in radically different forms but they have to exist.</w:t>
+      </w:r>
+    </w:p>
+    <w:p>
+      <w:r>
+        <w:t>What was once vaccum tubes became transistors and what was once just few transistors became an IC and then Microprocessor</w:t>
+      </w:r>
+      <w:r>
+        <w:t>s</w:t>
+      </w:r>
+      <w:r>
+        <w:t>.In this layer you deal with micro architectures, soldering and etc.</w:t>
+      </w:r>
+    </w:p>
+    <w:p>
+      <w:r>
+        <w:t>To keep track of things numbers have always been the easiest way, hence we communicate with computers through them. Naturally having foundational understanding of numbers</w:t>
+      </w:r>
+      <w:r>
+        <w:t xml:space="preserve"> I’m gonna need to first re explain some common knowledge</w:t>
+      </w:r>
+      <w:r>
+        <w:t xml:space="preserve"> about them</w:t>
+      </w:r>
+      <w:r>
+        <w:t xml:space="preserve"> in a more powerful way that warms up your mind ready to understand things a lot easier from this point on.</w:t>
+      </w:r>
+      <w:r>
+        <w:t xml:space="preserve"> </w:t>
+      </w:r>
+    </w:p>
+    <w:p>
+      <w:pPr>
+        <w:pStyle w:val="Heading4"/>
+      </w:pPr>
+      <w:r>
         <w:lastRenderedPageBreak/>
-        <w:t>Comp</w:t>
-      </w:r>
-      <w:r>
-        <w:t>uters</w:t>
-      </w:r>
-    </w:p>
-    <w:p>
-      <w:r>
-        <w:t xml:space="preserve">Any tool </w:t>
-      </w:r>
-      <w:r>
-        <w:t>flexible enough to handle any kind</w:t>
-      </w:r>
-      <w:r>
-        <w:t xml:space="preserve"> of computing could be regarded as computer</w:t>
-      </w:r>
-      <w:r>
-        <w:t xml:space="preserve">. Obviously the scales, flexibility, speed and etc sensibly do differ from a computer to another based on which purpose or purposes they are prioritizing but ultimately, there are certain logically necessary conceptual roles that MUST </w:t>
-      </w:r>
-      <w:r>
-        <w:t xml:space="preserve">and do exist </w:t>
-      </w:r>
-      <w:r>
-        <w:t>in any computer</w:t>
-      </w:r>
-      <w:r>
-        <w:t>:</w:t>
-      </w:r>
-    </w:p>
-    <w:p>
-      <w:r>
-        <w:t>- Some piece</w:t>
-      </w:r>
-      <w:r>
-        <w:t>(s)</w:t>
-      </w:r>
-      <w:r>
-        <w:t xml:space="preserve"> of hardware to keep track of computations and data.</w:t>
-      </w:r>
-    </w:p>
-    <w:p>
-      <w:r>
-        <w:t>- Some piece</w:t>
-      </w:r>
-      <w:r>
-        <w:t>(s)</w:t>
-      </w:r>
-      <w:r>
-        <w:t xml:space="preserve"> of hardware to manage the data.</w:t>
-      </w:r>
-    </w:p>
-    <w:p>
-      <w:r>
-        <w:t>-</w:t>
-      </w:r>
-      <w:r>
-        <w:t xml:space="preserve"> Some </w:t>
-      </w:r>
-      <w:r>
-        <w:t>pieces(s) of hardware</w:t>
-      </w:r>
-      <w:r>
-        <w:t xml:space="preserve"> to communicate with it’s user.</w:t>
-      </w:r>
-    </w:p>
-    <w:p>
-      <w:r>
-        <w:t>These could exist in radically different forms but they have to exist.</w:t>
-      </w:r>
-    </w:p>
-    <w:p>
-      <w:r>
-        <w:t>What was once vaccum tubes became transistors and what was once just few transistors became an IC and then Microprocessor</w:t>
-      </w:r>
-      <w:r>
-        <w:t>s</w:t>
-      </w:r>
-      <w:r>
-        <w:t>.In this layer you deal with micro architectures, soldering and etc.</w:t>
-      </w:r>
-    </w:p>
-    <w:p>
-      <w:r>
-        <w:t>To keep track of things numbers have always been the easiest way, hence we communicate with computers through them. Naturally having foundational understanding of numbers</w:t>
-      </w:r>
-      <w:r>
-        <w:t xml:space="preserve"> I’m gonna need to first re explain some common knowledge</w:t>
-      </w:r>
-      <w:r>
-        <w:t xml:space="preserve"> about them</w:t>
-      </w:r>
-      <w:r>
-        <w:t xml:space="preserve"> in a more powerful way that warms up your mind ready to understand things a lot easier from this point on.</w:t>
-      </w:r>
-      <w:r>
-        <w:t xml:space="preserve"> </w:t>
-      </w:r>
-    </w:p>
-    <w:p>
-      <w:pPr>
-        <w:pStyle w:val="Heading4"/>
-      </w:pPr>
-      <w:r>
         <w:t>Unique Symbol Set</w:t>
       </w:r>
     </w:p>
@@ -1841,7 +1933,6 @@
     </w:p>
     <w:p>
       <w:r>
-        <w:lastRenderedPageBreak/>
         <w:t>E.g: UNSS_Decimal = {0,1,2,3,4,5,6,7,8,9}</w:t>
       </w:r>
     </w:p>
@@ -1974,16 +2065,13 @@
         <w:pStyle w:val="Heading6"/>
       </w:pPr>
       <w:r>
+        <w:lastRenderedPageBreak/>
         <w:t>The Standard Counting Convention</w:t>
       </w:r>
     </w:p>
     <w:p>
       <w:r>
-        <w:t xml:space="preserve">The Standard Counting Convention or TSCC is just one of the common conventions that we organize digits with. It’s the most commonly used DIOC in real life for dealing with numbers but not necessarily the only one or the end to them. TSCC as the name suggests evolved alongside humans as a way to make </w:t>
-      </w:r>
-      <w:r>
-        <w:lastRenderedPageBreak/>
-        <w:t xml:space="preserve">possession measurement easier. The main idea behind it is simple: We count based and in relativism to a established threshold or </w:t>
+        <w:t xml:space="preserve">The Standard Counting Convention or TSCC is just one of the common conventions that we organize digits with. It’s the most commonly used DIOC in real life for dealing with numbers but not necessarily the only one or the end to them. TSCC as the name suggests evolved alongside humans as a way to make possession measurement easier. The main idea behind it is simple: We count based and in relativism to a established threshold or </w:t>
       </w:r>
       <w:r>
         <w:rPr>
@@ -2167,6 +2255,7 @@
         <w:pStyle w:val="Heading6"/>
       </w:pPr>
       <w:r>
+        <w:lastRenderedPageBreak/>
         <w:t>The floating point convention</w:t>
       </w:r>
     </w:p>
@@ -2199,198 +2288,196 @@
       </w:r>
       <w:r>
         <w:br/>
-      </w:r>
+        <w:t xml:space="preserve">- </w:t>
+      </w:r>
+      <w:r>
+        <w:rPr>
+          <w:b/>
+          <w:bCs/>
+        </w:rPr>
+        <w:t>Possession Measurement</w:t>
+      </w:r>
+      <w:r>
+        <w:t>: To determine/measure  the amount we own/possess of something.( Measurement has 0 in it cause we could “have nothing)</w:t>
+      </w:r>
+    </w:p>
+    <w:p>
+      <w:r>
+        <w:t xml:space="preserve">- </w:t>
+      </w:r>
+      <w:r>
+        <w:rPr>
+          <w:b/>
+          <w:bCs/>
+        </w:rPr>
+        <w:t>Counting</w:t>
+      </w:r>
+      <w:r>
+        <w:t>: To determine how many of  1 existing object we have.</w:t>
+      </w:r>
+    </w:p>
+    <w:p>
+      <w:r>
+        <w:t xml:space="preserve">- </w:t>
+      </w:r>
+      <w:r>
+        <w:rPr>
+          <w:b/>
+          <w:bCs/>
+        </w:rPr>
+        <w:t>Calculations</w:t>
+      </w:r>
+      <w:r>
+        <w:t>: To keep track of changes.</w:t>
+      </w:r>
+    </w:p>
+    <w:p>
+      <w:r>
+        <w:t xml:space="preserve">- </w:t>
+      </w:r>
+      <w:r>
+        <w:rPr>
+          <w:b/>
+          <w:bCs/>
+        </w:rPr>
+        <w:t>Identification</w:t>
+      </w:r>
+      <w:r>
+        <w:t>: A number could be used to represent a unique possibility.</w:t>
+      </w:r>
+    </w:p>
+    <w:p>
+      <w:r>
+        <w:t>Digital logic is about at times using all these capabilities of numbers at times in parallel to their full extent to achieve and assist computations.</w:t>
+      </w:r>
+    </w:p>
+    <w:p>
+      <w:pPr>
+        <w:pStyle w:val="Heading6"/>
+      </w:pPr>
+      <w:r>
+        <w:t>Numeric Systems</w:t>
+      </w:r>
+    </w:p>
+    <w:p>
+      <w:r>
+        <w:t xml:space="preserve">The number of different possibilities/states a single digit can represent is set by it’s numeric system. A </w:t>
+      </w:r>
+      <w:r>
+        <w:rPr>
+          <w:b/>
+          <w:bCs/>
+        </w:rPr>
+        <w:t xml:space="preserve">numeric system defines UNSS and </w:t>
+      </w:r>
+      <w:r>
+        <w:rPr>
+          <w:b/>
+          <w:bCs/>
+        </w:rPr>
+        <w:t xml:space="preserve">the </w:t>
+      </w:r>
+      <w:r>
+        <w:rPr>
+          <w:b/>
+          <w:bCs/>
+        </w:rPr>
+        <w:t>numeric base</w:t>
+      </w:r>
+      <w:r>
+        <w:t xml:space="preserve">. Since in computers at the basic level we are really using numbers to measure the amount of  data that the components “possess” or “own”  we could also say the </w:t>
+      </w:r>
+      <w:r>
+        <w:rPr>
+          <w:b/>
+          <w:bCs/>
+        </w:rPr>
+        <w:t>Numeric System</w:t>
+      </w:r>
+      <w:r>
+        <w:rPr>
+          <w:b/>
+          <w:bCs/>
+        </w:rPr>
+        <w:t>s</w:t>
+      </w:r>
+      <w:r>
+        <w:rPr>
+          <w:b/>
+          <w:bCs/>
+        </w:rPr>
+        <w:t xml:space="preserve"> in</w:t>
+      </w:r>
+      <w:r>
+        <w:rPr>
+          <w:b/>
+          <w:bCs/>
+        </w:rPr>
+        <w:t xml:space="preserve"> </w:t>
+      </w:r>
+      <w:r>
+        <w:rPr>
+          <w:b/>
+          <w:bCs/>
+        </w:rPr>
+        <w:t xml:space="preserve">CS set </w:t>
+      </w:r>
+      <w:r>
+        <w:rPr>
+          <w:b/>
+          <w:bCs/>
+        </w:rPr>
+        <w:t>the</w:t>
+      </w:r>
+      <w:r>
+        <w:rPr>
+          <w:b/>
+          <w:bCs/>
+        </w:rPr>
+        <w:t xml:space="preserve"> threshold of the states of possession</w:t>
+      </w:r>
+      <w:r>
+        <w:rPr>
+          <w:b/>
+          <w:bCs/>
+        </w:rPr>
+        <w:t>/count of unique possibilities</w:t>
+      </w:r>
+      <w:r>
+        <w:rPr>
+          <w:b/>
+          <w:bCs/>
+        </w:rPr>
+        <w:t xml:space="preserve"> that a digit could </w:t>
+      </w:r>
+      <w:r>
+        <w:rPr>
+          <w:b/>
+          <w:bCs/>
+        </w:rPr>
+        <w:t xml:space="preserve">hold </w:t>
+      </w:r>
+      <w:r>
+        <w:rPr>
+          <w:b/>
+          <w:bCs/>
+        </w:rPr>
+        <w:t>(which we’ll call range count from this point on)</w:t>
+      </w:r>
+      <w:r>
+        <w:rPr>
+          <w:b/>
+          <w:bCs/>
+        </w:rPr>
+        <w:t xml:space="preserve"> </w:t>
+      </w:r>
+      <w:r>
+        <w:t>(yeah I know you probably understood nothing, but it  was just an extremely short and beautiful way to sum it up, it sounded so good).</w:t>
+      </w:r>
+    </w:p>
+    <w:p>
       <w:r>
         <w:lastRenderedPageBreak/>
-        <w:t xml:space="preserve">- </w:t>
-      </w:r>
-      <w:r>
-        <w:rPr>
-          <w:b/>
-          <w:bCs/>
-        </w:rPr>
-        <w:t>Possession Measurement</w:t>
-      </w:r>
-      <w:r>
-        <w:t>: To determine/measure  the amount we own/possess of something.( Measurement has 0 in it cause we could “have nothing)</w:t>
-      </w:r>
-    </w:p>
-    <w:p>
-      <w:r>
-        <w:t xml:space="preserve">- </w:t>
-      </w:r>
-      <w:r>
-        <w:rPr>
-          <w:b/>
-          <w:bCs/>
-        </w:rPr>
-        <w:t>Counting</w:t>
-      </w:r>
-      <w:r>
-        <w:t>: To determine how many of  1 existing object we have.</w:t>
-      </w:r>
-    </w:p>
-    <w:p>
-      <w:r>
-        <w:t xml:space="preserve">- </w:t>
-      </w:r>
-      <w:r>
-        <w:rPr>
-          <w:b/>
-          <w:bCs/>
-        </w:rPr>
-        <w:t>Calculations</w:t>
-      </w:r>
-      <w:r>
-        <w:t>: To keep track of changes.</w:t>
-      </w:r>
-    </w:p>
-    <w:p>
-      <w:r>
-        <w:t xml:space="preserve">- </w:t>
-      </w:r>
-      <w:r>
-        <w:rPr>
-          <w:b/>
-          <w:bCs/>
-        </w:rPr>
-        <w:t>Identification</w:t>
-      </w:r>
-      <w:r>
-        <w:t>: A number could be used to represent a unique possibility.</w:t>
-      </w:r>
-    </w:p>
-    <w:p>
-      <w:r>
-        <w:t>Digital logic is about at times using all these capabilities of numbers at times in parallel to their full extent to achieve and assist computations.</w:t>
-      </w:r>
-    </w:p>
-    <w:p>
-      <w:pPr>
-        <w:pStyle w:val="Heading6"/>
-      </w:pPr>
-      <w:r>
-        <w:t>Numeric Systems</w:t>
-      </w:r>
-    </w:p>
-    <w:p>
-      <w:r>
-        <w:t xml:space="preserve">The number of different possibilities/states a single digit can represent is set by it’s numeric system. A </w:t>
-      </w:r>
-      <w:r>
-        <w:rPr>
-          <w:b/>
-          <w:bCs/>
-        </w:rPr>
-        <w:t xml:space="preserve">numeric system defines UNSS and </w:t>
-      </w:r>
-      <w:r>
-        <w:rPr>
-          <w:b/>
-          <w:bCs/>
-        </w:rPr>
-        <w:t xml:space="preserve">the </w:t>
-      </w:r>
-      <w:r>
-        <w:rPr>
-          <w:b/>
-          <w:bCs/>
-        </w:rPr>
-        <w:t>numeric base</w:t>
-      </w:r>
-      <w:r>
-        <w:t xml:space="preserve">. Since in computers at the basic level we are really using numbers to measure the amount of  data that the components “possess” or “own”  we could also say the </w:t>
-      </w:r>
-      <w:r>
-        <w:rPr>
-          <w:b/>
-          <w:bCs/>
-        </w:rPr>
-        <w:t>Numeric System</w:t>
-      </w:r>
-      <w:r>
-        <w:rPr>
-          <w:b/>
-          <w:bCs/>
-        </w:rPr>
-        <w:t>s</w:t>
-      </w:r>
-      <w:r>
-        <w:rPr>
-          <w:b/>
-          <w:bCs/>
-        </w:rPr>
-        <w:t xml:space="preserve"> in</w:t>
-      </w:r>
-      <w:r>
-        <w:rPr>
-          <w:b/>
-          <w:bCs/>
-        </w:rPr>
-        <w:t xml:space="preserve"> </w:t>
-      </w:r>
-      <w:r>
-        <w:rPr>
-          <w:b/>
-          <w:bCs/>
-        </w:rPr>
-        <w:t xml:space="preserve">CS set </w:t>
-      </w:r>
-      <w:r>
-        <w:rPr>
-          <w:b/>
-          <w:bCs/>
-        </w:rPr>
-        <w:t>the</w:t>
-      </w:r>
-      <w:r>
-        <w:rPr>
-          <w:b/>
-          <w:bCs/>
-        </w:rPr>
-        <w:t xml:space="preserve"> threshold of the states of possession</w:t>
-      </w:r>
-      <w:r>
-        <w:rPr>
-          <w:b/>
-          <w:bCs/>
-        </w:rPr>
-        <w:t>/count of unique possibilities</w:t>
-      </w:r>
-      <w:r>
-        <w:rPr>
-          <w:b/>
-          <w:bCs/>
-        </w:rPr>
-        <w:t xml:space="preserve"> that a digit could </w:t>
-      </w:r>
-      <w:r>
-        <w:rPr>
-          <w:b/>
-          <w:bCs/>
-        </w:rPr>
-        <w:t xml:space="preserve">hold </w:t>
-      </w:r>
-      <w:r>
-        <w:rPr>
-          <w:b/>
-          <w:bCs/>
-        </w:rPr>
-        <w:t>(which we’ll call range count from this point on)</w:t>
-      </w:r>
-      <w:r>
-        <w:rPr>
-          <w:b/>
-          <w:bCs/>
-        </w:rPr>
-        <w:t xml:space="preserve"> </w:t>
-      </w:r>
-      <w:r>
-        <w:t>(yeah I know you probably understood nothing, but it  was just an extremely short and beautiful way to sum it up, it sounded so good).</w:t>
-      </w:r>
-    </w:p>
-    <w:p>
-      <w:r>
         <w:t xml:space="preserve">- For </w:t>
       </w:r>
       <w:r>
@@ -2473,7 +2560,6 @@
     </w:p>
     <w:p>
       <w:r>
-        <w:lastRenderedPageBreak/>
         <w:t>NOTE: Range count does NOT conceptually equal Base and it is possible to have and define numeric systems that have different range count and bases. They are usually the same because we start from zero in our common possession measurement usage of numbers (which is what we’ll be dealing with 99% of the times) but just to be sure the generic formula for calculating it is:</w:t>
       </w:r>
     </w:p>
@@ -2626,6 +2712,7 @@
     </w:p>
     <w:p>
       <w:r>
+        <w:lastRenderedPageBreak/>
         <w:t xml:space="preserve">As a result of the two statements above the </w:t>
       </w:r>
       <w:r>
@@ -2686,7 +2773,6 @@
         </w:numPr>
       </w:pPr>
       <w:r>
-        <w:lastRenderedPageBreak/>
         <w:t>Mega = 2</w:t>
       </w:r>
       <w:r>
@@ -2778,6 +2864,7 @@
         <w:pStyle w:val="Heading7"/>
       </w:pPr>
       <w:r>
+        <w:lastRenderedPageBreak/>
         <w:t>Value Equalization</w:t>
       </w:r>
     </w:p>
@@ -2840,7 +2927,6 @@
         <w:ind w:left="720"/>
       </w:pPr>
       <w:r>
-        <w:lastRenderedPageBreak/>
         <w:t xml:space="preserve">1- We sensibly divide the value to the target numeric system’s range count. </w:t>
       </w:r>
     </w:p>
@@ -2874,9 +2960,137 @@
     </w:p>
     <w:p>
       <w:pPr>
+        <w:rPr>
+          <w:b/>
+          <w:bCs/>
+          <w:color w:val="FFFF00"/>
+          <w:u w:val="single"/>
+        </w:rPr>
+      </w:pPr>
+      <w:r>
+        <w:rPr>
+          <w:b/>
+          <w:bCs/>
+          <w:color w:val="FFFF00"/>
+          <w:highlight w:val="red"/>
+          <w:u w:val="single"/>
+        </w:rPr>
+        <w:t>IN DECIMIAL TO HEXADECIMAL CONVERSION WE CANT USE THE “JUST REPLACE” THE COUNTER PART IN HEXADECIMAL NOTATION AS HEXA DECIMAL DIGITS COULD STILL POSSIBLY HAVE CAPACITY TO BE LEFT FOR F</w:t>
+      </w:r>
+      <w:r>
+        <w:rPr>
+          <w:b/>
+          <w:bCs/>
+          <w:color w:val="FFFF00"/>
+          <w:highlight w:val="red"/>
+          <w:u w:val="single"/>
+        </w:rPr>
+        <w:t>IL</w:t>
+      </w:r>
+      <w:r>
+        <w:rPr>
+          <w:b/>
+          <w:bCs/>
+          <w:color w:val="FFFF00"/>
+          <w:highlight w:val="red"/>
+          <w:u w:val="single"/>
+        </w:rPr>
+        <w:t>LING</w:t>
+      </w:r>
+      <w:r>
+        <w:rPr>
+          <w:b/>
+          <w:bCs/>
+          <w:color w:val="FFFF00"/>
+          <w:highlight w:val="red"/>
+          <w:u w:val="single"/>
+        </w:rPr>
+        <w:t>.</w:t>
+      </w:r>
+    </w:p>
+    <w:p>
+      <w:pPr>
+        <w:rPr>
+          <w:b/>
+          <w:bCs/>
+          <w:color w:val="FFFF00"/>
+        </w:rPr>
+      </w:pPr>
+      <w:r>
+        <w:rPr>
+          <w:b/>
+          <w:bCs/>
+          <w:color w:val="FFFF00"/>
+          <w:highlight w:val="red"/>
+          <w:u w:val="single"/>
+        </w:rPr>
+        <w:t xml:space="preserve">DURING BASE SAME BASE DIVISON IN NON DECIMAL NUMBERS WHERE THE DIGITS GO ABOVE 1 REMEMBER THE GOLDEN RULE OF </w:t>
+      </w:r>
+      <w:r>
+        <w:rPr>
+          <w:b/>
+          <w:bCs/>
+          <w:color w:val="FFFF00"/>
+          <w:highlight w:val="red"/>
+          <w:u w:val="single"/>
+        </w:rPr>
+        <w:t>“</w:t>
+      </w:r>
+      <w:r>
+        <w:rPr>
+          <w:b/>
+          <w:bCs/>
+          <w:color w:val="FFFF00"/>
+          <w:highlight w:val="red"/>
+          <w:u w:val="single"/>
+        </w:rPr>
+        <w:t xml:space="preserve">ONLY A FULFILLED </w:t>
+      </w:r>
+      <w:r>
+        <w:rPr>
+          <w:b/>
+          <w:bCs/>
+          <w:color w:val="FFFF00"/>
+          <w:highlight w:val="red"/>
+          <w:u w:val="single"/>
+        </w:rPr>
+        <w:t>CYCLE LEADS TO A CARRY”.</w:t>
+      </w:r>
+    </w:p>
+    <w:p>
+      <w:pPr>
+        <w:rPr>
+          <w:b/>
+          <w:bCs/>
+          <w:color w:val="FFFF00"/>
+          <w:u w:val="single"/>
+        </w:rPr>
+      </w:pPr>
+      <w:r>
+        <w:rPr>
+          <w:b/>
+          <w:bCs/>
+          <w:color w:val="000000" w:themeColor="text1"/>
+          <w:u w:val="single"/>
+        </w:rPr>
+        <w:t xml:space="preserve"> </w:t>
+      </w:r>
+      <w:r>
+        <w:rPr>
+          <w:b/>
+          <w:bCs/>
+          <w:color w:val="FFFF00"/>
+          <w:u w:val="single"/>
+        </w:rPr>
+        <w:t xml:space="preserve">                                                                                                                          </w:t>
+      </w:r>
+    </w:p>
+    <w:p>
+      <w:pPr>
         <w:pStyle w:val="Heading6"/>
       </w:pPr>
       <w:r>
+        <w:lastRenderedPageBreak/>
         <w:t>Complements</w:t>
       </w:r>
     </w:p>
@@ -2955,42 +3169,39 @@
         <w:t>Signed and unsigned floating point numbers</w:t>
       </w:r>
     </w:p>
+    <w:p>
+      <w:pPr>
+        <w:pStyle w:val="Heading7"/>
+      </w:pPr>
+      <w:r>
+        <w:t>Signed and Unsigned floating point</w:t>
+      </w:r>
+    </w:p>
+    <w:p>
+      <w:r>
+        <w:t>[sign][Mantissa]e[Exponent]</w:t>
+      </w:r>
+    </w:p>
+    <w:p>
+      <w:r>
+        <w:t>The number of bits for mantissa and exponent are fixed.</w:t>
+      </w:r>
+    </w:p>
+    <w:p>
+      <w:pPr>
+        <w:pStyle w:val="Heading4"/>
+      </w:pPr>
+      <w:r>
+        <w:t>Vaccum Tubes</w:t>
+      </w:r>
+    </w:p>
     <w:p/>
-    <w:p/>
-    <w:p/>
-    <w:p>
-      <w:pPr>
-        <w:pStyle w:val="Heading7"/>
+    <w:p>
+      <w:pPr>
+        <w:pStyle w:val="Heading4"/>
       </w:pPr>
       <w:r>
         <w:lastRenderedPageBreak/>
-        <w:t>Signed and Unsigned floating point</w:t>
-      </w:r>
-    </w:p>
-    <w:p>
-      <w:r>
-        <w:t>[sign][Mantissa]e[Exponent]</w:t>
-      </w:r>
-    </w:p>
-    <w:p>
-      <w:r>
-        <w:t>The number of bits for mantissa and exponent are fixed.</w:t>
-      </w:r>
-    </w:p>
-    <w:p>
-      <w:pPr>
-        <w:pStyle w:val="Heading4"/>
-      </w:pPr>
-      <w:r>
-        <w:t>Vaccum Tubes</w:t>
-      </w:r>
-    </w:p>
-    <w:p/>
-    <w:p>
-      <w:pPr>
-        <w:pStyle w:val="Heading4"/>
-      </w:pPr>
-      <w:r>
         <w:t>Transistors</w:t>
       </w:r>
     </w:p>
@@ -3026,7 +3237,6 @@
         <w:pStyle w:val="Heading4"/>
       </w:pPr>
       <w:r>
-        <w:lastRenderedPageBreak/>
         <w:t>I/O</w:t>
       </w:r>
     </w:p>
@@ -3063,6 +3273,7 @@
         <w:pStyle w:val="Heading4"/>
       </w:pPr>
       <w:r>
+        <w:lastRenderedPageBreak/>
         <w:t>Controller</w:t>
       </w:r>
     </w:p>
@@ -3135,338 +3346,6 @@
         <w:pStyle w:val="Heading4"/>
       </w:pPr>
       <w:r>
-        <w:lastRenderedPageBreak/>
-        <w:t>ISA</w:t>
-      </w:r>
-    </w:p>
-    <w:p>
-      <w:pPr>
-        <w:pStyle w:val="IntenseQuote"/>
-      </w:pPr>
-      <w:r>
-        <w:t>Processors operates based on a simple instruction set architecture AKA (ISA).</w:t>
-      </w:r>
-    </w:p>
-    <w:p/>
-    <w:p>
-      <w:pPr>
-        <w:pStyle w:val="Heading4"/>
-      </w:pPr>
-      <w:r>
-        <w:t>Micro Processors</w:t>
-      </w:r>
-    </w:p>
-    <w:p>
-      <w:pPr>
-        <w:pStyle w:val="IntenseQuote"/>
-      </w:pPr>
-      <w:r>
-        <w:t>CPUs basic operations are always in one of these groups:</w:t>
-      </w:r>
-    </w:p>
-    <w:p>
-      <w:pPr>
-        <w:pStyle w:val="IntenseQuote"/>
-      </w:pPr>
-      <w:r>
-        <w:t>Load: Copy byte/word from memory to CPU register,overwtiring previous val.</w:t>
-      </w:r>
-    </w:p>
-    <w:p>
-      <w:pPr>
-        <w:pStyle w:val="IntenseQuote"/>
-      </w:pPr>
-      <w:r>
-        <w:t>Store: Copy byte/word from register to memory.</w:t>
-      </w:r>
-    </w:p>
-    <w:p>
-      <w:pPr>
-        <w:pStyle w:val="IntenseQuote"/>
-      </w:pPr>
-      <w:r>
-        <w:t xml:space="preserve">Operate: Copy contents of two register to </w:t>
-      </w:r>
-      <w:r>
-        <w:rPr>
-          <w:u w:val="single"/>
-        </w:rPr>
-        <w:t>ALU</w:t>
-      </w:r>
-      <w:r>
-        <w:t xml:space="preserve">  to perform an arithmetic operation and then store the result in a register overwriting it’s previous value.</w:t>
-      </w:r>
-    </w:p>
-    <w:p>
-      <w:pPr>
-        <w:pStyle w:val="IntenseQuote"/>
-      </w:pPr>
-      <w:r>
-        <w:lastRenderedPageBreak/>
-        <w:t>Jump: Extract word from the instruction itself and copy it into program counter. Overwriting previous val.</w:t>
-      </w:r>
-      <w:r>
-        <w:rPr>
-          <w:b/>
-          <w:bCs/>
-          <w:i w:val="0"/>
-          <w:iCs w:val="0"/>
-          <w:caps/>
-        </w:rPr>
-        <w:t xml:space="preserve"> </w:t>
-      </w:r>
-      <w:r>
-        <w:rPr>
-          <w:b/>
-          <w:bCs/>
-          <w:i w:val="0"/>
-          <w:iCs w:val="0"/>
-          <w:caps/>
-        </w:rPr>
-        <w:t>Computer Systems  A Programmer’s perspective</w:t>
-      </w:r>
-    </w:p>
-    <w:p/>
-    <w:p>
-      <w:pPr>
-        <w:pStyle w:val="IntenseQuote"/>
-        <w:rPr>
-          <w:b/>
-          <w:bCs/>
-          <w:i w:val="0"/>
-          <w:iCs w:val="0"/>
-          <w:caps/>
-        </w:rPr>
-      </w:pPr>
-      <w:r>
-        <w:t>They execute machine instructions they get from a memory. They have a word size storage device (register) called program counter (PC) pointing tat the address of machine instruction in their memory. The processor reads instruction from pc and interprets and does the operations.</w:t>
-      </w:r>
-      <w:r>
-        <w:rPr>
-          <w:b/>
-          <w:bCs/>
-          <w:i w:val="0"/>
-          <w:iCs w:val="0"/>
-          <w:caps/>
-        </w:rPr>
-        <w:t xml:space="preserve"> </w:t>
-      </w:r>
-      <w:r>
-        <w:rPr>
-          <w:b/>
-          <w:bCs/>
-          <w:i w:val="0"/>
-          <w:iCs w:val="0"/>
-          <w:caps/>
-        </w:rPr>
-        <w:t>Computer Systems  A Programmer’s perspective</w:t>
-      </w:r>
-    </w:p>
-    <w:p>
-      <w:pPr>
-        <w:pStyle w:val="Heading4"/>
-      </w:pPr>
-      <w:r>
-        <w:lastRenderedPageBreak/>
-        <w:t>Registers</w:t>
-      </w:r>
-    </w:p>
-    <w:p>
-      <w:pPr>
-        <w:pStyle w:val="Heading4"/>
-      </w:pPr>
-      <w:r>
-        <w:t>Register File</w:t>
-      </w:r>
-    </w:p>
-    <w:p>
-      <w:pPr>
-        <w:pStyle w:val="IntenseQuote"/>
-        <w:rPr>
-          <w:b/>
-          <w:bCs/>
-          <w:i w:val="0"/>
-          <w:iCs w:val="0"/>
-          <w:caps/>
-        </w:rPr>
-      </w:pPr>
-      <w:r>
-        <w:t xml:space="preserve">Register file is a small collection of word size registers, each with its own unique name. </w:t>
-      </w:r>
-      <w:r>
-        <w:rPr>
-          <w:b/>
-          <w:bCs/>
-          <w:i w:val="0"/>
-          <w:iCs w:val="0"/>
-          <w:caps/>
-        </w:rPr>
-        <w:t>Computer Systems  A Programmer’s perspective</w:t>
-      </w:r>
-    </w:p>
-    <w:p>
-      <w:pPr>
-        <w:pStyle w:val="Heading4"/>
-      </w:pPr>
-      <w:r>
-        <w:t>Cache</w:t>
-      </w:r>
-    </w:p>
-    <w:p>
-      <w:pPr>
-        <w:pStyle w:val="IntenseQuote"/>
-        <w:rPr>
-          <w:b/>
-          <w:bCs/>
-          <w:i w:val="0"/>
-          <w:iCs w:val="0"/>
-          <w:caps/>
-        </w:rPr>
-      </w:pPr>
-      <w:r>
-        <w:t>They serve as temporary staging areas for the information likely to be needed in near future.</w:t>
-      </w:r>
-      <w:r>
-        <w:rPr>
-          <w:b/>
-          <w:bCs/>
-          <w:i w:val="0"/>
-          <w:iCs w:val="0"/>
-          <w:caps/>
-        </w:rPr>
-        <w:t xml:space="preserve"> </w:t>
-      </w:r>
-      <w:r>
-        <w:rPr>
-          <w:b/>
-          <w:bCs/>
-          <w:i w:val="0"/>
-          <w:iCs w:val="0"/>
-          <w:caps/>
-        </w:rPr>
-        <w:t>Computer Systems  A Programmer’s perspective</w:t>
-      </w:r>
-    </w:p>
-    <w:p>
-      <w:pPr>
-        <w:pStyle w:val="Heading5"/>
-      </w:pPr>
-      <w:r>
-        <w:lastRenderedPageBreak/>
-        <w:t>L1 Cache</w:t>
-      </w:r>
-    </w:p>
-    <w:p>
-      <w:pPr>
-        <w:pStyle w:val="IntenseQuote"/>
-      </w:pPr>
-      <w:r>
-        <w:t xml:space="preserve">L1 Cache on processor chip holds </w:t>
-      </w:r>
-      <w:r>
-        <w:rPr>
-          <w:u w:val="single"/>
-        </w:rPr>
-        <w:t>tens of thousands</w:t>
-      </w:r>
-      <w:r>
-        <w:t xml:space="preserve"> of bytes and can be accessed nearly as fast as the register file.</w:t>
-      </w:r>
-    </w:p>
-    <w:p>
-      <w:pPr>
-        <w:pStyle w:val="Heading5"/>
-      </w:pPr>
-      <w:r>
-        <w:t>L2 Cache</w:t>
-      </w:r>
-    </w:p>
-    <w:p>
-      <w:pPr>
-        <w:pStyle w:val="IntenseQuote"/>
-      </w:pPr>
-      <w:r>
-        <w:t xml:space="preserve">L2 Cache holds hundreds of thousands to millions of bytes and is connected to the processor by a special bus. Accessing it is 5 times slower than L1 but still 5 to 10 times faster than memory.L1 and L2 caches use a  hardware technology called Static Random Access Memory or SRAM for their implementation. </w:t>
-      </w:r>
-    </w:p>
-    <w:p>
-      <w:pPr>
-        <w:pStyle w:val="Heading4"/>
-      </w:pPr>
-      <w:r>
-        <w:t>ALU</w:t>
-      </w:r>
-    </w:p>
-    <w:p>
-      <w:pPr>
-        <w:pStyle w:val="IntenseQuote"/>
-      </w:pPr>
-      <w:r>
-        <w:t>The ALU computes new data and address values</w:t>
-      </w:r>
-    </w:p>
-    <w:p/>
-    <w:p>
-      <w:pPr>
-        <w:pStyle w:val="Heading4"/>
-      </w:pPr>
-      <w:r>
-        <w:lastRenderedPageBreak/>
-        <w:t>Micro Computers</w:t>
-      </w:r>
-    </w:p>
-    <w:p/>
-    <w:p>
-      <w:pPr>
-        <w:pStyle w:val="Heading4"/>
-      </w:pPr>
-      <w:r>
-        <w:t>Micro Architecture</w:t>
-      </w:r>
-    </w:p>
-    <w:p>
-      <w:pPr>
-        <w:pStyle w:val="IntenseQuote"/>
-      </w:pPr>
-      <w:r>
-        <w:t>Defines the actual implementation of the processor and it’s ISA</w:t>
-      </w:r>
-      <w:r>
-        <w:rPr>
-          <w:b/>
-          <w:bCs/>
-          <w:i w:val="0"/>
-          <w:iCs w:val="0"/>
-          <w:caps/>
-        </w:rPr>
-        <w:t xml:space="preserve"> </w:t>
-      </w:r>
-      <w:r>
-        <w:rPr>
-          <w:b/>
-          <w:bCs/>
-          <w:i w:val="0"/>
-          <w:iCs w:val="0"/>
-          <w:caps/>
-        </w:rPr>
-        <w:t>.</w:t>
-      </w:r>
-      <w:r>
-        <w:rPr>
-          <w:b/>
-          <w:bCs/>
-          <w:i w:val="0"/>
-          <w:iCs w:val="0"/>
-          <w:caps/>
-        </w:rPr>
-        <w:t>Computer Systems  A Programmer’s perspective</w:t>
-      </w:r>
-    </w:p>
-    <w:p>
-      <w:pPr>
-        <w:pStyle w:val="Heading4"/>
-      </w:pPr>
-      <w:r>
         <w:t>Endianness</w:t>
       </w:r>
     </w:p>
@@ -3487,7 +3366,7 @@
           <w:b/>
           <w:bCs/>
         </w:rPr>
-        <w:t>It’s used to indicate the load direction of the sequence of input bytes that fulfill our n-byted buffers</w:t>
+        <w:t>It’s used to indicate the load direction of the sequence of input multi byte values that fulfill our n-byted buffers</w:t>
       </w:r>
       <w:r>
         <w:rPr>
@@ -3549,7 +3428,7 @@
           <w:b/>
           <w:bCs/>
         </w:rPr>
-        <w:t>(Big Endian)</w:t>
+        <w:t>(Big Endian or Most Significant Byte or MSB)</w:t>
       </w:r>
     </w:p>
     <w:p>
@@ -3584,6 +3463,7 @@
           <w:b/>
           <w:bCs/>
         </w:rPr>
+        <w:lastRenderedPageBreak/>
         <w:t xml:space="preserve">the nth memory byte given to them backward </w:t>
       </w:r>
       <w:r>
@@ -3591,7 +3471,33 @@
           <w:b/>
           <w:bCs/>
         </w:rPr>
-        <w:t>(Little Endian)</w:t>
+        <w:t>(Little Endian or Least Significant Byte or LSB)</w:t>
+      </w:r>
+    </w:p>
+    <w:p>
+      <w:pPr>
+        <w:pStyle w:val="IntenseQuote"/>
+        <w:rPr>
+          <w:b/>
+          <w:bCs/>
+          <w:i w:val="0"/>
+          <w:iCs w:val="0"/>
+        </w:rPr>
+      </w:pPr>
+      <w:r>
+        <w:t>Many recent microprocessor chips are bi-endian</w:t>
+      </w:r>
+      <w:r>
+        <w:t>.</w:t>
+      </w:r>
+      <w:r>
+        <w:rPr>
+          <w:b/>
+          <w:bCs/>
+          <w:i w:val="0"/>
+          <w:iCs w:val="0"/>
+        </w:rPr>
+        <w:t>COMPUTER SYSTEMS A PROGRAMMER’S PERSPECTIVE</w:t>
       </w:r>
     </w:p>
     <w:p>
@@ -3604,8 +3510,49 @@
         <w:pStyle w:val="Heading4"/>
       </w:pPr>
       <w:r>
+        <w:t>ISA</w:t>
+      </w:r>
+    </w:p>
+    <w:p>
+      <w:pPr>
+        <w:pStyle w:val="IntenseQuote"/>
+      </w:pPr>
+      <w:r>
+        <w:t>Processors operates based on a simple instruction set architecture AKA (ISA).</w:t>
+      </w:r>
+    </w:p>
+    <w:p/>
+    <w:p>
+      <w:pPr>
+        <w:pStyle w:val="Heading4"/>
+      </w:pPr>
+      <w:r>
+        <w:t>Micro Processors</w:t>
+      </w:r>
+    </w:p>
+    <w:p>
+      <w:pPr>
+        <w:pStyle w:val="IntenseQuote"/>
+      </w:pPr>
+      <w:r>
+        <w:t>CPUs basic operations are always in one of these groups:</w:t>
+      </w:r>
+    </w:p>
+    <w:p>
+      <w:pPr>
+        <w:pStyle w:val="IntenseQuote"/>
+      </w:pPr>
+      <w:r>
+        <w:t>Load: Copy byte/word from memory to CPU register,overwtiring previous val.</w:t>
+      </w:r>
+    </w:p>
+    <w:p>
+      <w:pPr>
+        <w:pStyle w:val="IntenseQuote"/>
+      </w:pPr>
+      <w:r>
         <w:lastRenderedPageBreak/>
-        <w:t>Main Memory</w:t>
+        <w:t>Store: Copy byte/word from register to memory.</w:t>
       </w:r>
     </w:p>
     <w:p>
@@ -3613,7 +3560,24 @@
         <w:pStyle w:val="IntenseQuote"/>
       </w:pPr>
       <w:r>
-        <w:t>A temporary storage device that holds both a program and the data it manipulates while the processor is executing the program, it physically consists of a collection of dynamic random access memory (DRAM) chips.</w:t>
+        <w:t xml:space="preserve">Operate: Copy contents of two register to </w:t>
+      </w:r>
+      <w:r>
+        <w:rPr>
+          <w:u w:val="single"/>
+        </w:rPr>
+        <w:t>ALU</w:t>
+      </w:r>
+      <w:r>
+        <w:t xml:space="preserve">  to perform an arithmetic operation and then store the result in a register overwriting it’s previous value.</w:t>
+      </w:r>
+    </w:p>
+    <w:p>
+      <w:pPr>
+        <w:pStyle w:val="IntenseQuote"/>
+      </w:pPr>
+      <w:r>
+        <w:t>Jump: Extract word from the instruction itself and copy it into program counter. Overwriting previous val.</w:t>
       </w:r>
       <w:r>
         <w:rPr>
@@ -3636,129 +3600,7 @@
         <w:t>Computer Systems  A Programmer’s perspective</w:t>
       </w:r>
     </w:p>
-    <w:p>
-      <w:pPr>
-        <w:spacing w:line="259" w:lineRule="auto"/>
-      </w:pPr>
-    </w:p>
-    <w:p>
-      <w:pPr>
-        <w:spacing w:line="259" w:lineRule="auto"/>
-      </w:pPr>
-    </w:p>
-    <w:p>
-      <w:pPr>
-        <w:spacing w:line="259" w:lineRule="auto"/>
-      </w:pPr>
-    </w:p>
-    <w:p>
-      <w:pPr>
-        <w:spacing w:line="259" w:lineRule="auto"/>
-      </w:pPr>
-    </w:p>
-    <w:p>
-      <w:pPr>
-        <w:spacing w:line="259" w:lineRule="auto"/>
-      </w:pPr>
-    </w:p>
-    <w:p>
-      <w:pPr>
-        <w:spacing w:line="259" w:lineRule="auto"/>
-      </w:pPr>
-    </w:p>
-    <w:p>
-      <w:pPr>
-        <w:spacing w:line="259" w:lineRule="auto"/>
-      </w:pPr>
-    </w:p>
-    <w:p>
-      <w:pPr>
-        <w:spacing w:line="259" w:lineRule="auto"/>
-      </w:pPr>
-    </w:p>
     <w:p/>
-    <w:p>
-      <w:pPr>
-        <w:pStyle w:val="Heading3"/>
-      </w:pPr>
-      <w:r>
-        <w:t>The APIs</w:t>
-      </w:r>
-    </w:p>
-    <w:p>
-      <w:r>
-        <w:t>Your programmer at the lowest level is your PCB or Solder.</w:t>
-      </w:r>
-    </w:p>
-    <w:p>
-      <w:pPr>
-        <w:pStyle w:val="Heading3"/>
-      </w:pPr>
-      <w:r>
-        <w:lastRenderedPageBreak/>
-        <w:t>The Programs</w:t>
-      </w:r>
-    </w:p>
-    <w:p>
-      <w:pPr>
-        <w:pStyle w:val="Heading4"/>
-      </w:pPr>
-      <w:r>
-        <w:t>Voltage</w:t>
-      </w:r>
-      <w:r>
-        <w:t>(</w:t>
-      </w:r>
-      <w:r>
-        <w:t>s</w:t>
-      </w:r>
-      <w:r>
-        <w:t>)</w:t>
-      </w:r>
-    </w:p>
-    <w:p/>
-    <w:p>
-      <w:pPr>
-        <w:pStyle w:val="Heading4"/>
-      </w:pPr>
-      <w:r>
-        <w:t>Firmware</w:t>
-      </w:r>
-      <w:r>
-        <w:t>(s)</w:t>
-      </w:r>
-    </w:p>
-    <w:p/>
-    <w:p>
-      <w:pPr>
-        <w:pStyle w:val="Heading4"/>
-      </w:pPr>
-      <w:r>
-        <w:t>BIOS</w:t>
-      </w:r>
-      <w:r>
-        <w:t>(s)</w:t>
-      </w:r>
-    </w:p>
-    <w:p>
-      <w:pPr>
-        <w:pStyle w:val="Heading4"/>
-      </w:pPr>
-      <w:r>
-        <w:t>OS</w:t>
-      </w:r>
-      <w:r>
-        <w:t>(s)</w:t>
-      </w:r>
-    </w:p>
-    <w:p>
-      <w:pPr>
-        <w:pStyle w:val="Heading5"/>
-      </w:pPr>
-      <w:r>
-        <w:t>Flow of Apps in modern systems</w:t>
-      </w:r>
-    </w:p>
     <w:p>
       <w:pPr>
         <w:pStyle w:val="IntenseQuote"/>
@@ -3771,7 +3613,7 @@
         </w:rPr>
       </w:pPr>
       <w:r>
-        <w:t>The machine instructions for an app are originally stored on disk. When program is loaded, they are copied to main memory, as the processor runs the program, instructions are copied from main memory into the processor.</w:t>
+        <w:t>They execute machine instructions they get from a memory. They have a word size storage device (register) called program counter (PC) pointing tat the address of machine instruction in their memory. The processor reads instruction from pc and interprets and does the operations.</w:t>
       </w:r>
       <w:r>
         <w:rPr>
@@ -3794,11 +3636,660 @@
         <w:t>Computer Systems  A Programmer’s perspective</w:t>
       </w:r>
     </w:p>
+    <w:p>
+      <w:pPr>
+        <w:pStyle w:val="Heading5"/>
+      </w:pPr>
+      <w:r>
+        <w:lastRenderedPageBreak/>
+        <w:t>ISAs</w:t>
+      </w:r>
+    </w:p>
+    <w:p>
+      <w:pPr>
+        <w:pStyle w:val="Heading6"/>
+      </w:pPr>
+      <w:r>
+        <w:t>ARM</w:t>
+      </w:r>
+    </w:p>
+    <w:p>
+      <w:r>
+        <w:t>The ARM processors are usually bi – endian.</w:t>
+      </w:r>
+    </w:p>
+    <w:p>
+      <w:pPr>
+        <w:pStyle w:val="IntenseQuote"/>
+        <w:rPr>
+          <w:b/>
+          <w:bCs/>
+          <w:i w:val="0"/>
+          <w:iCs w:val="0"/>
+          <w:caps/>
+        </w:rPr>
+      </w:pPr>
+      <w:r>
+        <w:t>ARM microprocessors, used in many cell phones, have hardware that can operate in either little-or big-endian mode, but the two most common operating systems for these chips-Android (from Google) and IOS (from Apple)---0perate only in little-endian mode.</w:t>
+      </w:r>
+      <w:r>
+        <w:rPr>
+          <w:b/>
+          <w:bCs/>
+          <w:i w:val="0"/>
+          <w:iCs w:val="0"/>
+          <w:caps/>
+        </w:rPr>
+        <w:t xml:space="preserve"> </w:t>
+      </w:r>
+      <w:r>
+        <w:rPr>
+          <w:b/>
+          <w:bCs/>
+          <w:i w:val="0"/>
+          <w:iCs w:val="0"/>
+          <w:caps/>
+        </w:rPr>
+        <w:t>Computer Systems  A Programmer’s perspective</w:t>
+      </w:r>
+    </w:p>
+    <w:p>
+      <w:pPr>
+        <w:pStyle w:val="Heading6"/>
+      </w:pPr>
+      <w:r>
+        <w:t>Intel</w:t>
+      </w:r>
+    </w:p>
+    <w:p>
+      <w:pPr>
+        <w:pStyle w:val="IntenseQuote"/>
+      </w:pPr>
+      <w:r>
+        <w:t>Most Intel-compatible machines operate exclusively in little-endian mode. On the other hand, most machines from IBM and O</w:t>
+      </w:r>
+      <w:r>
+        <w:t>r</w:t>
+      </w:r>
+      <w:r>
+        <w:t>acle (arising from their acquisition of Sun Microsystems in 2010) operate in big-endian mode.</w:t>
+      </w:r>
+      <w:r>
+        <w:t xml:space="preserve"> </w:t>
+      </w:r>
+      <w:r>
+        <w:rPr>
+          <w:b/>
+          <w:bCs/>
+          <w:i w:val="0"/>
+          <w:iCs w:val="0"/>
+        </w:rPr>
+        <w:t>COMPUTER SYSTEMS A PROGRAMMER’S PERSPECTIVE</w:t>
+      </w:r>
+    </w:p>
+    <w:p>
+      <w:pPr>
+        <w:pStyle w:val="Heading4"/>
+      </w:pPr>
+      <w:r>
+        <w:lastRenderedPageBreak/>
+        <w:t>Registers</w:t>
+      </w:r>
+    </w:p>
+    <w:p>
+      <w:pPr>
+        <w:pStyle w:val="Heading4"/>
+      </w:pPr>
+      <w:r>
+        <w:t>Register File</w:t>
+      </w:r>
+    </w:p>
+    <w:p>
+      <w:pPr>
+        <w:pStyle w:val="IntenseQuote"/>
+        <w:rPr>
+          <w:b/>
+          <w:bCs/>
+          <w:i w:val="0"/>
+          <w:iCs w:val="0"/>
+          <w:caps/>
+        </w:rPr>
+      </w:pPr>
+      <w:r>
+        <w:t xml:space="preserve">Register file is a small collection of word size registers, each with its own unique name. </w:t>
+      </w:r>
+      <w:r>
+        <w:rPr>
+          <w:b/>
+          <w:bCs/>
+          <w:i w:val="0"/>
+          <w:iCs w:val="0"/>
+          <w:caps/>
+        </w:rPr>
+        <w:t>Computer Systems  A Programmer’s perspective</w:t>
+      </w:r>
+    </w:p>
+    <w:p>
+      <w:pPr>
+        <w:pStyle w:val="Heading4"/>
+      </w:pPr>
+      <w:r>
+        <w:t>Cache</w:t>
+      </w:r>
+    </w:p>
+    <w:p>
+      <w:pPr>
+        <w:pStyle w:val="IntenseQuote"/>
+        <w:rPr>
+          <w:b/>
+          <w:bCs/>
+          <w:i w:val="0"/>
+          <w:iCs w:val="0"/>
+          <w:caps/>
+        </w:rPr>
+      </w:pPr>
+      <w:r>
+        <w:t>They serve as temporary staging areas for the information likely to be needed in near future.</w:t>
+      </w:r>
+      <w:r>
+        <w:rPr>
+          <w:b/>
+          <w:bCs/>
+          <w:i w:val="0"/>
+          <w:iCs w:val="0"/>
+          <w:caps/>
+        </w:rPr>
+        <w:t xml:space="preserve"> </w:t>
+      </w:r>
+      <w:r>
+        <w:rPr>
+          <w:b/>
+          <w:bCs/>
+          <w:i w:val="0"/>
+          <w:iCs w:val="0"/>
+          <w:caps/>
+        </w:rPr>
+        <w:t>Computer Systems  A Programmer’s perspective</w:t>
+      </w:r>
+    </w:p>
+    <w:p/>
+    <w:p>
+      <w:pPr>
+        <w:pStyle w:val="Heading5"/>
+      </w:pPr>
+      <w:r>
+        <w:lastRenderedPageBreak/>
+        <w:t>L1 Cache</w:t>
+      </w:r>
+    </w:p>
+    <w:p>
+      <w:pPr>
+        <w:pStyle w:val="IntenseQuote"/>
+      </w:pPr>
+      <w:r>
+        <w:t xml:space="preserve">L1 Cache on processor chip holds </w:t>
+      </w:r>
+      <w:r>
+        <w:rPr>
+          <w:u w:val="single"/>
+        </w:rPr>
+        <w:t>tens of thousands</w:t>
+      </w:r>
+      <w:r>
+        <w:t xml:space="preserve"> of bytes and can be accessed nearly as fast as the register file.</w:t>
+      </w:r>
+    </w:p>
+    <w:p>
+      <w:pPr>
+        <w:pStyle w:val="Heading5"/>
+      </w:pPr>
+      <w:r>
+        <w:t>L2 Cache</w:t>
+      </w:r>
+    </w:p>
+    <w:p>
+      <w:pPr>
+        <w:pStyle w:val="IntenseQuote"/>
+      </w:pPr>
+      <w:r>
+        <w:t xml:space="preserve">L2 Cache holds hundreds of thousands to millions of bytes and is connected to the processor by a special bus. Accessing it is 5 times slower than L1 but still 5 to 10 times faster than memory.L1 and L2 caches use a  hardware technology called Static Random Access Memory or SRAM for their implementation. </w:t>
+      </w:r>
+    </w:p>
+    <w:p>
+      <w:pPr>
+        <w:pStyle w:val="Heading4"/>
+      </w:pPr>
+      <w:r>
+        <w:t>ALU</w:t>
+      </w:r>
+    </w:p>
+    <w:p>
+      <w:pPr>
+        <w:pStyle w:val="IntenseQuote"/>
+      </w:pPr>
+      <w:r>
+        <w:t>The ALU computes new data and address values</w:t>
+      </w:r>
+    </w:p>
+    <w:p/>
+    <w:p>
+      <w:pPr>
+        <w:pStyle w:val="Heading4"/>
+      </w:pPr>
+      <w:r>
+        <w:lastRenderedPageBreak/>
+        <w:t>Micro Architecture</w:t>
+      </w:r>
+    </w:p>
+    <w:p>
+      <w:pPr>
+        <w:pStyle w:val="IntenseQuote"/>
+      </w:pPr>
+      <w:r>
+        <w:t>Defines the actual implementation of the processor and it’s ISA</w:t>
+      </w:r>
+      <w:r>
+        <w:rPr>
+          <w:b/>
+          <w:bCs/>
+          <w:i w:val="0"/>
+          <w:iCs w:val="0"/>
+          <w:caps/>
+        </w:rPr>
+        <w:t xml:space="preserve"> </w:t>
+      </w:r>
+      <w:r>
+        <w:rPr>
+          <w:b/>
+          <w:bCs/>
+          <w:i w:val="0"/>
+          <w:iCs w:val="0"/>
+          <w:caps/>
+        </w:rPr>
+        <w:t>.</w:t>
+      </w:r>
+      <w:r>
+        <w:rPr>
+          <w:b/>
+          <w:bCs/>
+          <w:i w:val="0"/>
+          <w:iCs w:val="0"/>
+          <w:caps/>
+        </w:rPr>
+        <w:t>Computer Systems  A Programmer’s perspective</w:t>
+      </w:r>
+    </w:p>
+    <w:p>
+      <w:pPr>
+        <w:pStyle w:val="Heading4"/>
+      </w:pPr>
+      <w:r>
+        <w:t>Main Memory</w:t>
+      </w:r>
+    </w:p>
+    <w:p>
+      <w:pPr>
+        <w:pStyle w:val="IntenseQuote"/>
+      </w:pPr>
+      <w:r>
+        <w:t>A temporary storage device that holds both a program and the data it manipulates while the processor is executing the program, it physically consists of a collection of dynamic random access memory (DRAM) chips.</w:t>
+      </w:r>
+      <w:r>
+        <w:rPr>
+          <w:b/>
+          <w:bCs/>
+          <w:i w:val="0"/>
+          <w:iCs w:val="0"/>
+          <w:caps/>
+        </w:rPr>
+        <w:t xml:space="preserve"> </w:t>
+      </w:r>
+      <w:r>
+        <w:rPr>
+          <w:b/>
+          <w:bCs/>
+          <w:i w:val="0"/>
+          <w:iCs w:val="0"/>
+          <w:caps/>
+        </w:rPr>
+        <w:t>Computer Systems  A Programmer’s perspective</w:t>
+      </w:r>
+    </w:p>
+    <w:p>
+      <w:pPr>
+        <w:spacing w:line="259" w:lineRule="auto"/>
+      </w:pPr>
+    </w:p>
+    <w:p>
+      <w:pPr>
+        <w:spacing w:line="259" w:lineRule="auto"/>
+      </w:pPr>
+    </w:p>
+    <w:p>
+      <w:pPr>
+        <w:spacing w:line="259" w:lineRule="auto"/>
+      </w:pPr>
+    </w:p>
+    <w:p>
+      <w:pPr>
+        <w:pStyle w:val="Heading4"/>
+      </w:pPr>
+      <w:r>
+        <w:lastRenderedPageBreak/>
+        <w:t>Amdahls law</w:t>
+      </w:r>
+    </w:p>
+    <w:p>
+      <w:r>
+        <w:t>Principle: The performance and time efficiency is directly based on the increase in the efficiency of components that contribute to it and the domain of said component in the whole system.</w:t>
+      </w:r>
+    </w:p>
+    <w:p>
+      <w:r>
+        <w:t>Formula in simple words: The new time performance of system equals to the sum of the previous time performance of the unchanged components  and the reduced time of the improved component.</w:t>
+      </w:r>
+    </w:p>
+    <w:p>
+      <w:r>
+        <w:t>T</w:t>
+      </w:r>
+      <w:r>
+        <w:rPr>
+          <w:vertAlign w:val="subscript"/>
+        </w:rPr>
+        <w:t>new</w:t>
+      </w:r>
+      <w:r>
+        <w:t xml:space="preserve"> = (1-a) T</w:t>
+      </w:r>
+      <w:r>
+        <w:rPr>
+          <w:vertAlign w:val="subscript"/>
+        </w:rPr>
+        <w:t>old</w:t>
+      </w:r>
+      <w:r>
+        <w:t xml:space="preserve"> + (aT</w:t>
+      </w:r>
+      <w:r>
+        <w:rPr>
+          <w:vertAlign w:val="subscript"/>
+        </w:rPr>
+        <w:t>old</w:t>
+      </w:r>
+      <w:r>
+        <w:t>)/k</w:t>
+      </w:r>
+    </w:p>
+    <w:p>
+      <w:r>
+        <w:t>= T</w:t>
+      </w:r>
+      <w:r>
+        <w:rPr>
+          <w:vertAlign w:val="subscript"/>
+        </w:rPr>
+        <w:t>old</w:t>
+      </w:r>
+      <w:r>
+        <w:t xml:space="preserve"> [(1-a)+a/k]</w:t>
+      </w:r>
+    </w:p>
+    <w:p>
+      <w:r>
+        <w:t xml:space="preserve">In the formula: </w:t>
+      </w:r>
+    </w:p>
+    <w:p>
+      <w:r>
+        <w:t>- a is the domain of component.</w:t>
+      </w:r>
+    </w:p>
+    <w:p>
+      <w:r>
+        <w:t>- 1 is used to refer to the entirety of system to later be used for calculating the time of the parts outside the domain of component.</w:t>
+      </w:r>
+    </w:p>
+    <w:p>
+      <w:r>
+        <w:t>- k is the factor of performance, since here we’re calculating the reduced time NOT the performance boost to it we divide instead of multiplying.</w:t>
+      </w:r>
+    </w:p>
+    <w:p>
+      <w:r>
+        <w:t>And then the formula for speedup becomes S = T</w:t>
+      </w:r>
+      <w:r>
+        <w:rPr>
+          <w:vertAlign w:val="subscript"/>
+        </w:rPr>
+        <w:t>old</w:t>
+      </w:r>
+      <w:r>
+        <w:t>/T</w:t>
+      </w:r>
+      <w:r>
+        <w:rPr>
+          <w:vertAlign w:val="subscript"/>
+        </w:rPr>
+        <w:t>new</w:t>
+      </w:r>
+      <w:r>
+        <w:t xml:space="preserve"> </w:t>
+      </w:r>
+    </w:p>
+    <w:p>
+      <w:r>
+        <w:t>S = 1/ ((1-a)+a/k).</w:t>
+      </w:r>
+    </w:p>
+    <w:p>
+      <w:r>
+        <w:t>0.2 + 0.8/k</w:t>
+      </w:r>
+    </w:p>
+    <w:p>
+      <w:pPr>
+        <w:spacing w:line="259" w:lineRule="auto"/>
+      </w:pPr>
+    </w:p>
+    <w:p>
+      <w:pPr>
+        <w:spacing w:line="259" w:lineRule="auto"/>
+      </w:pPr>
+    </w:p>
+    <w:p>
+      <w:pPr>
+        <w:spacing w:line="259" w:lineRule="auto"/>
+      </w:pPr>
+    </w:p>
+    <w:p>
+      <w:pPr>
+        <w:spacing w:line="259" w:lineRule="auto"/>
+      </w:pPr>
+    </w:p>
+    <w:p>
+      <w:pPr>
+        <w:spacing w:line="259" w:lineRule="auto"/>
+      </w:pPr>
+    </w:p>
+    <w:p/>
+    <w:p>
+      <w:pPr>
+        <w:pStyle w:val="Heading3"/>
+      </w:pPr>
+      <w:r>
+        <w:t>The APIs</w:t>
+      </w:r>
+    </w:p>
+    <w:p>
+      <w:r>
+        <w:t>Your programmer at the lowest level is your PCB or Solder.</w:t>
+      </w:r>
+    </w:p>
+    <w:p>
+      <w:pPr>
+        <w:pStyle w:val="Heading4"/>
+      </w:pPr>
+      <w:r>
+        <w:t>Open GL</w:t>
+      </w:r>
+    </w:p>
+    <w:p/>
+    <w:p/>
+    <w:p>
+      <w:pPr>
+        <w:pStyle w:val="Heading4"/>
+      </w:pPr>
+      <w:r>
+        <w:t>WinSock</w:t>
+      </w:r>
+    </w:p>
+    <w:p/>
+    <w:p>
+      <w:pPr>
+        <w:pStyle w:val="Heading4"/>
+      </w:pPr>
+      <w:r>
+        <w:t>Direct X</w:t>
+      </w:r>
+    </w:p>
+    <w:p/>
+    <w:p>
+      <w:pPr>
+        <w:pStyle w:val="Heading4"/>
+      </w:pPr>
+      <w:r>
+        <w:t>JDK</w:t>
+      </w:r>
+    </w:p>
+    <w:p/>
+    <w:p>
+      <w:pPr>
+        <w:pStyle w:val="Heading4"/>
+      </w:pPr>
+      <w:r>
+        <w:lastRenderedPageBreak/>
+        <w:t>Microsoft Windows SDK</w:t>
+      </w:r>
+    </w:p>
     <w:p/>
     <w:p/>
     <w:p/>
     <w:p>
       <w:pPr>
+        <w:pStyle w:val="Heading3"/>
+      </w:pPr>
+      <w:r>
+        <w:t>The Programs</w:t>
+      </w:r>
+    </w:p>
+    <w:p>
+      <w:pPr>
+        <w:pStyle w:val="Heading4"/>
+      </w:pPr>
+      <w:r>
+        <w:t>Voltage</w:t>
+      </w:r>
+      <w:r>
+        <w:t>(</w:t>
+      </w:r>
+      <w:r>
+        <w:t>s</w:t>
+      </w:r>
+      <w:r>
+        <w:t>)</w:t>
+      </w:r>
+    </w:p>
+    <w:p/>
+    <w:p>
+      <w:pPr>
+        <w:pStyle w:val="Heading4"/>
+      </w:pPr>
+      <w:r>
+        <w:t>Firmware</w:t>
+      </w:r>
+      <w:r>
+        <w:t>(s)</w:t>
+      </w:r>
+    </w:p>
+    <w:p/>
+    <w:p>
+      <w:pPr>
+        <w:pStyle w:val="Heading4"/>
+      </w:pPr>
+      <w:r>
+        <w:t>BIOS</w:t>
+      </w:r>
+      <w:r>
+        <w:t>(s)</w:t>
+      </w:r>
+    </w:p>
+    <w:p>
+      <w:pPr>
+        <w:pStyle w:val="Heading4"/>
+      </w:pPr>
+      <w:r>
+        <w:t>OS</w:t>
+      </w:r>
+      <w:r>
+        <w:t>(s)</w:t>
+      </w:r>
+    </w:p>
+    <w:p>
+      <w:r>
+        <w:t>In this layer you deal with Computer Organization</w:t>
+      </w:r>
+    </w:p>
+    <w:p>
+      <w:pPr>
+        <w:pStyle w:val="Heading5"/>
+      </w:pPr>
+      <w:r>
+        <w:lastRenderedPageBreak/>
+        <w:t>Flow of Apps in modern systems</w:t>
+      </w:r>
+    </w:p>
+    <w:p>
+      <w:pPr>
+        <w:pStyle w:val="IntenseQuote"/>
+        <w:rPr>
+          <w:b/>
+          <w:bCs/>
+          <w:i w:val="0"/>
+          <w:iCs w:val="0"/>
+          <w:caps/>
+        </w:rPr>
+      </w:pPr>
+      <w:r>
+        <w:t>The machine instructions for an app are originally stored on disk. When program is loaded, they are copied to main memory, as the processor runs the program, instructions are copied from main memory into the processor.</w:t>
+      </w:r>
+      <w:r>
+        <w:rPr>
+          <w:b/>
+          <w:bCs/>
+          <w:i w:val="0"/>
+          <w:iCs w:val="0"/>
+          <w:caps/>
+        </w:rPr>
+        <w:t xml:space="preserve"> </w:t>
+      </w:r>
+      <w:r>
+        <w:rPr>
+          <w:b/>
+          <w:bCs/>
+          <w:i w:val="0"/>
+          <w:iCs w:val="0"/>
+          <w:caps/>
+        </w:rPr>
+        <w:t>Computer Systems  A Programmer’s perspective</w:t>
+      </w:r>
+    </w:p>
+    <w:p/>
+    <w:p/>
+    <w:p/>
+    <w:p>
+      <w:pPr>
         <w:pStyle w:val="IntenseQuote"/>
         <w:rPr>
           <w:b/>
@@ -3870,6 +4361,7 @@
         <w:pStyle w:val="Heading6"/>
       </w:pPr>
       <w:r>
+        <w:lastRenderedPageBreak/>
         <w:t>Virtualization</w:t>
       </w:r>
     </w:p>
@@ -3934,6 +4426,7 @@
         <w:pStyle w:val="Heading6"/>
       </w:pPr>
       <w:r>
+        <w:lastRenderedPageBreak/>
         <w:t>Memory</w:t>
       </w:r>
     </w:p>
@@ -4000,7 +4493,6 @@
         <w:pStyle w:val="Heading7"/>
       </w:pPr>
       <w:r>
-        <w:lastRenderedPageBreak/>
         <w:t>Memory Hierarchy</w:t>
       </w:r>
     </w:p>
@@ -4028,6 +4520,7 @@
         <w:pStyle w:val="Heading7"/>
       </w:pPr>
       <w:r>
+        <w:lastRenderedPageBreak/>
         <w:t>Direct Memory Access</w:t>
       </w:r>
     </w:p>
@@ -4058,12 +4551,6 @@
     <w:p>
       <w:pPr>
         <w:pStyle w:val="IntenseQuote"/>
-      </w:pPr>
-      <w:r>
-        <w:lastRenderedPageBreak/>
-        <w:t>A machine level program views memory as a very large array of bytes referred to as virtual memory. Each byte of which is represented by a unique number, called a virtual address. The set of virtual addresses is referred to as virtual address space.</w:t>
-      </w:r>
-      <w:r>
         <w:rPr>
           <w:b/>
           <w:bCs/>
@@ -4071,7 +4558,9 @@
           <w:iCs w:val="0"/>
           <w:caps/>
         </w:rPr>
-        <w:t xml:space="preserve"> </w:t>
+      </w:pPr>
+      <w:r>
+        <w:t>A machine level program views memory as a very large array of bytes referred to as virtual memory. Each byte of which is represented by a unique number, called a virtual address. The set of virtual addresses is referred to as virtual address space.</w:t>
       </w:r>
       <w:r>
         <w:rPr>
@@ -4081,93 +4570,7 @@
           <w:iCs w:val="0"/>
           <w:caps/>
         </w:rPr>
-        <w:t>Computer Systems  A Programmer’s perspective</w:t>
-      </w:r>
-    </w:p>
-    <w:p>
-      <w:pPr>
-        <w:pStyle w:val="Heading7"/>
-      </w:pPr>
-      <w:r>
-        <w:t>Memory Page</w:t>
-      </w:r>
-    </w:p>
-    <w:p>
-      <w:r>
-        <w:t xml:space="preserve">Why is it even a thing: To manage apps that areNow it is neither convenient nor optimized really to load apps at their entirety, hell the memory of the computer may NOT EVEN BE ENOUGH to hold them entirely. Each of these chunks have a contagious group of addresses  is called a </w:t>
-      </w:r>
-      <w:r>
-        <w:rPr>
-          <w:b/>
-          <w:bCs/>
-        </w:rPr>
-        <w:t>page</w:t>
-      </w:r>
-      <w:r>
-        <w:t xml:space="preserve">. The pages of an app form what’s </w:t>
-      </w:r>
-      <w:r>
-        <w:rPr>
-          <w:b/>
-          <w:bCs/>
-        </w:rPr>
-        <w:t>virtual address space</w:t>
-      </w:r>
-      <w:r>
-        <w:t xml:space="preserve">. For loading the app the wrapper unit for determining how much </w:t>
-      </w:r>
-      <w:r>
-        <w:rPr>
-          <w:b/>
-          <w:bCs/>
-        </w:rPr>
-        <w:t xml:space="preserve">virtual </w:t>
-      </w:r>
-      <w:r>
-        <w:t xml:space="preserve">memory is used is </w:t>
-      </w:r>
-      <w:r>
-        <w:rPr>
-          <w:b/>
-          <w:bCs/>
-        </w:rPr>
-        <w:t>page</w:t>
-      </w:r>
-      <w:r>
-        <w:rPr>
-          <w:b/>
-          <w:bCs/>
-        </w:rPr>
-        <w:t xml:space="preserve"> </w:t>
-      </w:r>
-      <w:r>
-        <w:t xml:space="preserve">(which itself is based on bytes obviously) and each page is a contagious series of bytes. For physical memory the same kinda wrapper unit exists and is called </w:t>
-      </w:r>
-      <w:r>
-        <w:rPr>
-          <w:b/>
-          <w:bCs/>
-        </w:rPr>
-        <w:t>pageframe</w:t>
-      </w:r>
-      <w:r>
-        <w:t>. The pages and page frames typically are of the same size.</w:t>
-      </w:r>
-    </w:p>
-    <w:p>
-      <w:pPr>
-        <w:pStyle w:val="Heading6"/>
-      </w:pPr>
-      <w:r>
-        <w:t>System Call</w:t>
-      </w:r>
-    </w:p>
-    <w:p>
-      <w:pPr>
-        <w:pStyle w:val="IntenseQuote"/>
-      </w:pPr>
-      <w:r>
-        <w:t>Is a special function that passes control to the operating system.</w:t>
+        <w:t xml:space="preserve"> </w:t>
       </w:r>
       <w:r>
         <w:rPr>
@@ -4177,7 +4580,142 @@
           <w:iCs w:val="0"/>
           <w:caps/>
         </w:rPr>
-        <w:t xml:space="preserve"> </w:t>
+        <w:t>Computer Systems  A Programmer’s perspective</w:t>
+      </w:r>
+    </w:p>
+    <w:p>
+      <w:pPr>
+        <w:rPr>
+          <w:rFonts w:ascii="Gloucester MT Extra Condensed" w:eastAsia="Gloucester MT Extra Condensed" w:hAnsi="Gloucester MT Extra Condensed" w:cs="Gloucester MT Extra Condensed"/>
+          <w:color w:val="000000" w:themeColor="text1"/>
+          <w:sz w:val="40"/>
+        </w:rPr>
+      </w:pPr>
+    </w:p>
+    <w:p>
+      <w:pPr>
+        <w:pStyle w:val="Heading8"/>
+      </w:pPr>
+      <w:r>
+        <w:lastRenderedPageBreak/>
+        <w:t>Word size</w:t>
+      </w:r>
+    </w:p>
+    <w:p>
+      <w:pPr>
+        <w:pStyle w:val="IntenseQuote"/>
+      </w:pPr>
+      <w:r>
+        <w:t>Every computer has a word size</w:t>
+      </w:r>
+      <w:r>
+        <w:t xml:space="preserve"> defines</w:t>
+      </w:r>
+      <w:r>
+        <w:t xml:space="preserve"> the nominal size of pointer data, </w:t>
+      </w:r>
+      <w:r>
+        <w:t xml:space="preserve">the range of </w:t>
+      </w:r>
+      <w:r>
+        <w:t xml:space="preserve">Virtual address is </w:t>
+      </w:r>
+      <w:r>
+        <w:t>one of the many things determined by this word size.</w:t>
+      </w:r>
+      <w:r>
+        <w:t xml:space="preserve"> COMPUTER SYSTEMS A PROGRAMMER’S PERSPECTIVE</w:t>
+      </w:r>
+    </w:p>
+    <w:p/>
+    <w:p/>
+    <w:p/>
+    <w:p/>
+    <w:p>
+      <w:pPr>
+        <w:pStyle w:val="Heading7"/>
+      </w:pPr>
+      <w:r>
+        <w:t>Memory Page</w:t>
+      </w:r>
+    </w:p>
+    <w:p>
+      <w:r>
+        <w:t xml:space="preserve">Why is it even a thing: To manage apps that areNow it is neither convenient nor optimized really to load apps at their entirety, hell the memory of the computer may NOT EVEN BE ENOUGH to hold them entirely. Each of these chunks have a contagious group of addresses  is called a </w:t>
+      </w:r>
+      <w:r>
+        <w:rPr>
+          <w:b/>
+          <w:bCs/>
+        </w:rPr>
+        <w:t>page</w:t>
+      </w:r>
+      <w:r>
+        <w:t xml:space="preserve">. The pages of an app form what’s </w:t>
+      </w:r>
+      <w:r>
+        <w:rPr>
+          <w:b/>
+          <w:bCs/>
+        </w:rPr>
+        <w:t>virtual address space</w:t>
+      </w:r>
+      <w:r>
+        <w:t xml:space="preserve">. For loading the app the wrapper unit for determining how much </w:t>
+      </w:r>
+      <w:r>
+        <w:rPr>
+          <w:b/>
+          <w:bCs/>
+        </w:rPr>
+        <w:t xml:space="preserve">virtual </w:t>
+      </w:r>
+      <w:r>
+        <w:t xml:space="preserve">memory is used is </w:t>
+      </w:r>
+      <w:r>
+        <w:rPr>
+          <w:b/>
+          <w:bCs/>
+        </w:rPr>
+        <w:t>page</w:t>
+      </w:r>
+      <w:r>
+        <w:rPr>
+          <w:b/>
+          <w:bCs/>
+        </w:rPr>
+        <w:t xml:space="preserve"> </w:t>
+      </w:r>
+      <w:r>
+        <w:t xml:space="preserve">(which itself is based on bytes obviously) and each page is a contagious series of bytes. For physical memory the same kinda wrapper unit exists and is called </w:t>
+      </w:r>
+      <w:r>
+        <w:rPr>
+          <w:b/>
+          <w:bCs/>
+        </w:rPr>
+        <w:t>pageframe</w:t>
+      </w:r>
+      <w:r>
+        <w:t>. The pages and page frames typically are of the same size.</w:t>
+      </w:r>
+    </w:p>
+    <w:p>
+      <w:pPr>
+        <w:pStyle w:val="Heading6"/>
+      </w:pPr>
+      <w:r>
+        <w:lastRenderedPageBreak/>
+        <w:t>System Call</w:t>
+      </w:r>
+    </w:p>
+    <w:p>
+      <w:pPr>
+        <w:pStyle w:val="IntenseQuote"/>
+      </w:pPr>
+      <w:r>
+        <w:t>Is a special function that passes control to the operating system.</w:t>
       </w:r>
       <w:r>
         <w:rPr>
@@ -4187,26 +4725,9 @@
           <w:iCs w:val="0"/>
           <w:caps/>
         </w:rPr>
-        <w:t>Computer Systems  A Programmer’s perspective</w:t>
-      </w:r>
-    </w:p>
-    <w:p>
-      <w:r>
-        <w:lastRenderedPageBreak/>
-        <w:t>Context Switches are managed thru system calls to kernel for managing process creation.</w:t>
-      </w:r>
-    </w:p>
-    <w:p>
-      <w:pPr>
-        <w:pStyle w:val="Heading6"/>
-      </w:pPr>
-      <w:r>
-        <w:t>Kernel</w:t>
-      </w:r>
-    </w:p>
-    <w:p>
-      <w:pPr>
-        <w:pStyle w:val="IntenseQuote"/>
+        <w:t xml:space="preserve"> </w:t>
+      </w:r>
+      <w:r>
         <w:rPr>
           <w:b/>
           <w:bCs/>
@@ -4214,11 +4735,25 @@
           <w:iCs w:val="0"/>
           <w:caps/>
         </w:rPr>
-      </w:pPr>
-      <w:r>
-        <w:t xml:space="preserve">Kernel is part of the operating system that always resides in memory. </w:t>
-      </w:r>
-      <w:r>
+        <w:t>Computer Systems  A Programmer’s perspective</w:t>
+      </w:r>
+    </w:p>
+    <w:p>
+      <w:r>
+        <w:t>Context Switches are managed thru system calls to kernel for managing process creation.</w:t>
+      </w:r>
+    </w:p>
+    <w:p>
+      <w:pPr>
+        <w:pStyle w:val="Heading6"/>
+      </w:pPr>
+      <w:r>
+        <w:t>Kernel</w:t>
+      </w:r>
+    </w:p>
+    <w:p>
+      <w:pPr>
+        <w:pStyle w:val="IntenseQuote"/>
         <w:rPr>
           <w:b/>
           <w:bCs/>
@@ -4226,13 +4761,11 @@
           <w:iCs w:val="0"/>
           <w:caps/>
         </w:rPr>
-        <w:t>Computer Systems  A Programmer’s perspective</w:t>
-      </w:r>
-    </w:p>
-    <w:p/>
-    <w:p>
-      <w:pPr>
-        <w:pStyle w:val="IntenseQuote"/>
+      </w:pPr>
+      <w:r>
+        <w:t xml:space="preserve">Kernel is part of the operating system that always resides in memory. </w:t>
+      </w:r>
+      <w:r>
         <w:rPr>
           <w:b/>
           <w:bCs/>
@@ -4240,11 +4773,13 @@
           <w:iCs w:val="0"/>
           <w:caps/>
         </w:rPr>
-      </w:pPr>
-      <w:r>
-        <w:t xml:space="preserve">Kernel is not a separate process but a collection of code and data structures that system uses to manage all processes. </w:t>
-      </w:r>
-      <w:r>
+        <w:t>Computer Systems  A Programmer’s perspective</w:t>
+      </w:r>
+    </w:p>
+    <w:p/>
+    <w:p>
+      <w:pPr>
+        <w:pStyle w:val="IntenseQuote"/>
         <w:rPr>
           <w:b/>
           <w:bCs/>
@@ -4252,6 +4787,18 @@
           <w:iCs w:val="0"/>
           <w:caps/>
         </w:rPr>
+      </w:pPr>
+      <w:r>
+        <w:t xml:space="preserve">Kernel is not a separate process but a collection of code and data structures that system uses to manage all processes. </w:t>
+      </w:r>
+      <w:r>
+        <w:rPr>
+          <w:b/>
+          <w:bCs/>
+          <w:i w:val="0"/>
+          <w:iCs w:val="0"/>
+          <w:caps/>
+        </w:rPr>
         <w:t>Computer Systems  A Programmer’s perspective</w:t>
       </w:r>
     </w:p>
@@ -4260,6 +4807,7 @@
         <w:pStyle w:val="Heading6"/>
       </w:pPr>
       <w:r>
+        <w:lastRenderedPageBreak/>
         <w:t>CPUs</w:t>
       </w:r>
     </w:p>
@@ -4273,7 +4821,6 @@
         <w:pStyle w:val="Heading6"/>
       </w:pPr>
       <w:r>
-        <w:lastRenderedPageBreak/>
         <w:t>Process</w:t>
       </w:r>
     </w:p>
@@ -4362,11 +4909,11 @@
         <w:t xml:space="preserve">Tue operating system performs this interleaving with a mechanism known as context switching. </w:t>
       </w:r>
       <w:r>
-        <w:t xml:space="preserve">When the operating system decides to transfer control from the current process to some new process, it performs a context switch by saving the context of the </w:t>
+        <w:t xml:space="preserve">When the operating system </w:t>
       </w:r>
       <w:r>
         <w:lastRenderedPageBreak/>
-        <w:t>current process, restoring the context of the new process, and</w:t>
+        <w:t>decides to transfer control from the current process to some new process, it performs a context switch by saving the context of the current process, restoring the context of the new process, and</w:t>
       </w:r>
       <w:r>
         <w:t xml:space="preserve"> </w:t>
@@ -4429,12 +4976,12 @@
     </w:p>
     <w:p>
       <w:r>
+        <w:lastRenderedPageBreak/>
         <w:t xml:space="preserve">In case of hyperthreading, each core technically achieves the illusion of handling multiple threads thru its </w:t>
       </w:r>
     </w:p>
     <w:p>
       <w:r>
-        <w:lastRenderedPageBreak/>
         <w:t>The virtual memory of a process contains different sections for code, data, heap , shared libs, stack and kernel virtual memory.</w:t>
       </w:r>
     </w:p>
@@ -4456,124 +5003,6 @@
       </w:r>
       <w:r>
         <w:t xml:space="preserve"> process can actually consist•of multiple execution units, called threads, each running in the context of the process "11-d sharing the same code and global data'.</w:t>
-      </w:r>
-    </w:p>
-    <w:p>
-      <w:pPr>
-        <w:pStyle w:val="Heading6"/>
-      </w:pPr>
-      <w:r>
-        <w:t>Amdahls law</w:t>
-      </w:r>
-    </w:p>
-    <w:p>
-      <w:r>
-        <w:t>Principle: The performance and time efficiency is directly based on the increase in the efficiency of components that contribute to it and the domain of said component in the whole system.</w:t>
-      </w:r>
-    </w:p>
-    <w:p>
-      <w:r>
-        <w:t>Formula in simple words: The new time performance of system equals to the sum of the previous time performance of the unchanged components  and the reduced time of the improved component.</w:t>
-      </w:r>
-    </w:p>
-    <w:p>
-      <w:r>
-        <w:t>T</w:t>
-      </w:r>
-      <w:r>
-        <w:rPr>
-          <w:vertAlign w:val="subscript"/>
-        </w:rPr>
-        <w:t>new</w:t>
-      </w:r>
-      <w:r>
-        <w:t xml:space="preserve"> = (1-a) T</w:t>
-      </w:r>
-      <w:r>
-        <w:rPr>
-          <w:vertAlign w:val="subscript"/>
-        </w:rPr>
-        <w:t>old</w:t>
-      </w:r>
-      <w:r>
-        <w:t xml:space="preserve"> + (aT</w:t>
-      </w:r>
-      <w:r>
-        <w:rPr>
-          <w:vertAlign w:val="subscript"/>
-        </w:rPr>
-        <w:t>old</w:t>
-      </w:r>
-      <w:r>
-        <w:t>)/k</w:t>
-      </w:r>
-    </w:p>
-    <w:p>
-      <w:r>
-        <w:t>= T</w:t>
-      </w:r>
-      <w:r>
-        <w:rPr>
-          <w:vertAlign w:val="subscript"/>
-        </w:rPr>
-        <w:t>old</w:t>
-      </w:r>
-      <w:r>
-        <w:t xml:space="preserve"> [(1-a)+a/k]</w:t>
-      </w:r>
-    </w:p>
-    <w:p>
-      <w:r>
-        <w:t xml:space="preserve">In the formula: </w:t>
-      </w:r>
-    </w:p>
-    <w:p>
-      <w:r>
-        <w:t>- a is the domain of component.</w:t>
-      </w:r>
-    </w:p>
-    <w:p>
-      <w:r>
-        <w:lastRenderedPageBreak/>
-        <w:t>- 1 is used to refer to the entirety of system to later be used for calculating the time of the parts outside the domain of component.</w:t>
-      </w:r>
-    </w:p>
-    <w:p>
-      <w:r>
-        <w:t>- k is the factor of performance, since here we’re calculating the reduced time NOT the performance boost to it we divide instead of multiplying.</w:t>
-      </w:r>
-    </w:p>
-    <w:p>
-      <w:r>
-        <w:t>And then the formula for speedup becomes S = T</w:t>
-      </w:r>
-      <w:r>
-        <w:rPr>
-          <w:vertAlign w:val="subscript"/>
-        </w:rPr>
-        <w:t>old</w:t>
-      </w:r>
-      <w:r>
-        <w:t>/T</w:t>
-      </w:r>
-      <w:r>
-        <w:rPr>
-          <w:vertAlign w:val="subscript"/>
-        </w:rPr>
-        <w:t>new</w:t>
-      </w:r>
-      <w:r>
-        <w:t xml:space="preserve"> </w:t>
-      </w:r>
-    </w:p>
-    <w:p>
-      <w:r>
-        <w:t>S = 1/ ((1-a)+a/k).</w:t>
-      </w:r>
-    </w:p>
-    <w:p>
-      <w:r>
-        <w:t>0.2 + 0.8/k</w:t>
       </w:r>
     </w:p>
     <w:p>
@@ -7736,6 +8165,32 @@
         <w:t xml:space="preserve"> Memory Allocation</w:t>
       </w:r>
     </w:p>
+    <w:p/>
+    <w:p>
+      <w:pPr>
+        <w:pStyle w:val="Heading6"/>
+      </w:pPr>
+      <w:r>
+        <w:t>Pointer casting</w:t>
+      </w:r>
+    </w:p>
+    <w:p>
+      <w:pPr>
+        <w:rPr>
+          <w:szCs w:val="48"/>
+        </w:rPr>
+      </w:pPr>
+      <w:r>
+        <w:t>Pointer casting can allow us to view bytes differently tho not advised</w:t>
+      </w:r>
+      <w:r>
+        <w:rPr>
+          <w:szCs w:val="48"/>
+        </w:rPr>
+        <w:t>.</w:t>
+      </w:r>
+    </w:p>
+    <w:p/>
     <w:p>
       <w:pPr>
         <w:pStyle w:val="Heading5"/>
@@ -7757,11 +8212,72 @@
         <w:t>All data types are ultimately broken down to bits. With data types we merely define the number of bits and how they are to be treated.</w:t>
       </w:r>
     </w:p>
+    <w:p/>
     <w:p>
       <w:pPr>
         <w:pStyle w:val="Heading7"/>
       </w:pPr>
       <w:r>
+        <w:t>int3</w:t>
+      </w:r>
+      <w:r>
+        <w:t>2_t</w:t>
+      </w:r>
+    </w:p>
+    <w:p/>
+    <w:p>
+      <w:pPr>
+        <w:pStyle w:val="Heading7"/>
+      </w:pPr>
+      <w:r>
+        <w:t>u</w:t>
+      </w:r>
+      <w:r>
+        <w:t>int32_t</w:t>
+      </w:r>
+    </w:p>
+    <w:p/>
+    <w:p>
+      <w:pPr>
+        <w:pStyle w:val="Heading7"/>
+      </w:pPr>
+      <w:r>
+        <w:t>int</w:t>
+      </w:r>
+      <w:r>
+        <w:t>64</w:t>
+      </w:r>
+      <w:r>
+        <w:t>_t</w:t>
+      </w:r>
+    </w:p>
+    <w:p/>
+    <w:p>
+      <w:pPr>
+        <w:pStyle w:val="Heading7"/>
+      </w:pPr>
+      <w:r>
+        <w:t>u</w:t>
+      </w:r>
+      <w:r>
+        <w:t>i</w:t>
+      </w:r>
+      <w:r>
+        <w:t>nt</w:t>
+      </w:r>
+      <w:r>
+        <w:t>64</w:t>
+      </w:r>
+      <w:r>
+        <w:t>_t</w:t>
+      </w:r>
+    </w:p>
+    <w:p/>
+    <w:p>
+      <w:pPr>
+        <w:pStyle w:val="Heading7"/>
+      </w:pPr>
+      <w:r>
         <w:t>char</w:t>
       </w:r>
     </w:p>
@@ -7781,7 +8297,6 @@
         <w:pStyle w:val="Heading8"/>
       </w:pPr>
       <w:r>
-        <w:lastRenderedPageBreak/>
         <w:t>Character Constant Literal</w:t>
       </w:r>
     </w:p>
@@ -7804,6 +8319,7 @@
         <w:pStyle w:val="Heading7"/>
       </w:pPr>
       <w:r>
+        <w:lastRenderedPageBreak/>
         <w:t>Pointers</w:t>
       </w:r>
     </w:p>
@@ -7817,18 +8333,13 @@
       </w:r>
     </w:p>
     <w:p>
-      <w:pPr>
+      <w:r>
+        <w:t>In order to cast pointers use the following notation:</w:t>
+      </w:r>
+      <w:r>
         <w:rPr>
           <w:szCs w:val="48"/>
         </w:rPr>
-      </w:pPr>
-      <w:r>
-        <w:t>In order to cast pointers use the following notation:</w:t>
-      </w:r>
-      <w:r>
-        <w:rPr>
-          <w:szCs w:val="48"/>
-        </w:rPr>
         <w:br/>
       </w:r>
       <w:r>
@@ -7838,7 +8349,6 @@
         <w:t>;</w:t>
       </w:r>
     </w:p>
-    <w:p/>
     <w:p>
       <w:pPr>
         <w:pStyle w:val="Heading6"/>
@@ -7876,49 +8386,49 @@
         <w:pStyle w:val="Heading7"/>
       </w:pPr>
       <w:r>
+        <w:t>Ternary Operator</w:t>
+      </w:r>
+    </w:p>
+    <w:p>
+      <w:pPr>
+        <w:pStyle w:val="Heading8"/>
+      </w:pPr>
+      <w:r>
+        <w:t>? operator</w:t>
+      </w:r>
+    </w:p>
+    <w:p>
+      <w:r>
+        <w:t>This operator is used for conditional existence of a piece of code where we can’t use if. It kinda behaves like a conditional inclusion preprocessor whose life time continues after the preprocessing stage.</w:t>
+      </w:r>
+    </w:p>
+    <w:p>
+      <w:pPr>
+        <w:pStyle w:val="Heading7"/>
+      </w:pPr>
+      <w:r>
+        <w:t>Bitwise Operators</w:t>
+      </w:r>
+    </w:p>
+    <w:p>
+      <w:pPr>
+        <w:pStyle w:val="Heading8"/>
+      </w:pPr>
+      <w:r>
+        <w:t>! Operator</w:t>
+      </w:r>
+    </w:p>
+    <w:p>
+      <w:r>
+        <w:t>It’s sensitive to zero and turns it to 1 otherwise turns it to 0.</w:t>
+      </w:r>
+    </w:p>
+    <w:p>
+      <w:pPr>
+        <w:pStyle w:val="Heading6"/>
+      </w:pPr>
+      <w:r>
         <w:lastRenderedPageBreak/>
-        <w:t>Ternary Operator</w:t>
-      </w:r>
-    </w:p>
-    <w:p>
-      <w:pPr>
-        <w:pStyle w:val="Heading8"/>
-      </w:pPr>
-      <w:r>
-        <w:t>? operator</w:t>
-      </w:r>
-    </w:p>
-    <w:p>
-      <w:r>
-        <w:t>This operator is used for conditional existence of a piece of code where we can’t use if. It kinda behaves like a conditional inclusion preprocessor whose life time continues after the preprocessing stage.</w:t>
-      </w:r>
-    </w:p>
-    <w:p>
-      <w:pPr>
-        <w:pStyle w:val="Heading7"/>
-      </w:pPr>
-      <w:r>
-        <w:t>Bitwise Operators</w:t>
-      </w:r>
-    </w:p>
-    <w:p>
-      <w:pPr>
-        <w:pStyle w:val="Heading8"/>
-      </w:pPr>
-      <w:r>
-        <w:t>! Operator</w:t>
-      </w:r>
-    </w:p>
-    <w:p>
-      <w:r>
-        <w:t>It’s sensitive to zero and turns it to 1 otherwise turns it to 0.</w:t>
-      </w:r>
-    </w:p>
-    <w:p>
-      <w:pPr>
-        <w:pStyle w:val="Heading6"/>
-      </w:pPr>
-      <w:r>
         <w:t>Definitions</w:t>
       </w:r>
     </w:p>
@@ -7986,11 +8496,7 @@
         <w:t xml:space="preserve">The loop counter SHOULD and consequently does end at the fail condition. Which is why it’s advised to define counter </w:t>
       </w:r>
       <w:r>
-        <w:t xml:space="preserve">within the parentheses as </w:t>
-      </w:r>
-      <w:r>
-        <w:lastRenderedPageBreak/>
-        <w:t xml:space="preserve">otherwise you </w:t>
+        <w:t xml:space="preserve">within the parentheses as otherwise you </w:t>
       </w:r>
       <w:r>
         <w:t>MIGHT forget this and use the fail value-ed counter unless you’re aware of what you’re doing</w:t>
@@ -8096,6 +8602,7 @@
         <w:pStyle w:val="Heading6"/>
       </w:pPr>
       <w:r>
+        <w:lastRenderedPageBreak/>
         <w:t>Functions</w:t>
       </w:r>
     </w:p>
@@ -8160,7 +8667,6 @@
     </w:p>
     <w:p>
       <w:r>
-        <w:lastRenderedPageBreak/>
         <w:t>- #include &lt;filename.h&gt;: Searches the compiler’s include directories for the</w:t>
       </w:r>
       <w:r>
@@ -8196,6 +8702,7 @@
         <w:pStyle w:val="Heading7"/>
       </w:pPr>
       <w:r>
+        <w:lastRenderedPageBreak/>
         <w:t>#if</w:t>
       </w:r>
     </w:p>
@@ -8256,7 +8763,6 @@
         <w:pStyle w:val="Heading7"/>
       </w:pPr>
       <w:r>
-        <w:lastRenderedPageBreak/>
         <w:t>Static Variables</w:t>
       </w:r>
     </w:p>
@@ -8294,7 +8800,6 @@
         <w:pStyle w:val="Heading6"/>
       </w:pPr>
       <w:r>
-        <w:lastRenderedPageBreak/>
         <w:t>Apendix B:</w:t>
       </w:r>
       <w:r>
@@ -8481,7 +8986,11 @@
         <w:t xml:space="preserve"> first unnamed argument</w:t>
       </w:r>
       <w:r>
-        <w:t xml:space="preserve"> of the </w:t>
+        <w:t xml:space="preserve"> of </w:t>
+      </w:r>
+      <w:r>
+        <w:lastRenderedPageBreak/>
+        <w:t xml:space="preserve">the </w:t>
       </w:r>
       <w:r>
         <w:t>function,</w:t>
@@ -8500,7 +9009,6 @@
         <w:pStyle w:val="Heading8"/>
       </w:pPr>
       <w:r>
-        <w:lastRenderedPageBreak/>
         <w:t>va_end</w:t>
       </w:r>
       <w:r>
@@ -8664,7 +9172,6 @@
     </w:p>
     <w:p>
       <w:r>
-        <w:lastRenderedPageBreak/>
         <w:t>long double     %Lf</w:t>
       </w:r>
     </w:p>
@@ -8736,6 +9243,7 @@
     </w:p>
     <w:p>
       <w:r>
+        <w:lastRenderedPageBreak/>
         <w:t>short            %hd</w:t>
       </w:r>
     </w:p>
@@ -8789,13 +9297,154 @@
         <w:pStyle w:val="Heading6"/>
       </w:pPr>
       <w:r>
+        <w:t>stderr</w:t>
+      </w:r>
+    </w:p>
+    <w:p>
+      <w:r>
+        <w:t>standard error stream.</w:t>
+      </w:r>
+    </w:p>
+    <w:p>
+      <w:pPr>
+        <w:pStyle w:val="Heading6"/>
+      </w:pPr>
+      <w:r>
+        <w:t>stdin</w:t>
+      </w:r>
+    </w:p>
+    <w:p>
+      <w:r>
+        <w:t>standard input stream , can be used with putchar and getchar.</w:t>
+      </w:r>
+    </w:p>
+    <w:p>
+      <w:pPr>
+        <w:pStyle w:val="Heading6"/>
+      </w:pPr>
+      <w:r>
+        <w:t>stdout</w:t>
+      </w:r>
+    </w:p>
+    <w:p>
+      <w:r>
+        <w:t>standard output steam.</w:t>
+      </w:r>
+    </w:p>
+    <w:p>
+      <w:pPr>
+        <w:pStyle w:val="Heading6"/>
+      </w:pPr>
+      <w:r>
+        <w:t>fgetc</w:t>
+      </w:r>
+    </w:p>
+    <w:p>
+      <w:r>
+        <w:t xml:space="preserve">The function </w:t>
+      </w:r>
+      <w:r>
+        <w:rPr>
+          <w:b/>
+          <w:bCs/>
+          <w:u w:val="single"/>
+        </w:rPr>
+        <w:t>READS</w:t>
+      </w:r>
+      <w:r>
+        <w:t xml:space="preserve"> </w:t>
+      </w:r>
+      <w:r>
+        <w:t xml:space="preserve">a </w:t>
+      </w:r>
+      <w:r>
+        <w:t>character from</w:t>
+      </w:r>
+      <w:r>
+        <w:t xml:space="preserve"> </w:t>
+      </w:r>
+      <w:r>
+        <w:t>the</w:t>
+      </w:r>
+      <w:r>
+        <w:t xml:space="preserve"> file</w:t>
+      </w:r>
+      <w:r>
+        <w:t xml:space="preserve"> given to it as argument in the form of a pointer</w:t>
+      </w:r>
+    </w:p>
+    <w:p>
+      <w:pPr>
+        <w:pStyle w:val="Heading6"/>
+      </w:pPr>
+      <w:r>
+        <w:t>fputc</w:t>
+      </w:r>
+      <w:r>
+        <w:t>()</w:t>
+      </w:r>
+    </w:p>
+    <w:p>
+      <w:r>
+        <w:t>The function</w:t>
+      </w:r>
+      <w:r>
+        <w:t xml:space="preserve"> </w:t>
+      </w:r>
+      <w:r>
+        <w:rPr>
+          <w:b/>
+          <w:bCs/>
+          <w:u w:val="single"/>
+        </w:rPr>
+        <w:t>WRITES</w:t>
+      </w:r>
+      <w:r>
+        <w:t xml:space="preserve"> </w:t>
+      </w:r>
+      <w:r>
+        <w:t>the character in its first argument to the file specified by the FILE pointer in its second argument.</w:t>
+      </w:r>
+    </w:p>
+    <w:p>
+      <w:pPr>
+        <w:pStyle w:val="Heading6"/>
+      </w:pPr>
+      <w:r>
         <w:lastRenderedPageBreak/>
-        <w:t>stderr</w:t>
-      </w:r>
-    </w:p>
-    <w:p>
-      <w:r>
-        <w:t>standard error stream.</w:t>
+        <w:t>fopen</w:t>
+      </w:r>
+      <w:r>
+        <w:t>()</w:t>
+      </w:r>
+    </w:p>
+    <w:p>
+      <w:r>
+        <w:t>The function is used to create a file</w:t>
+      </w:r>
+      <w:r>
+        <w:t xml:space="preserve"> with the name(extension included) of it’s first argument</w:t>
+      </w:r>
+      <w:r>
+        <w:t xml:space="preserve"> for the mode defined in it’s second argument</w:t>
+      </w:r>
+      <w:r>
+        <w:t>.</w:t>
+      </w:r>
+      <w:r>
+        <w:t xml:space="preserve"> </w:t>
+      </w:r>
+      <w:r>
+        <w:t>It</w:t>
+      </w:r>
+      <w:r>
+        <w:t xml:space="preserve"> returns the address of it</w:t>
+      </w:r>
+      <w:r>
+        <w:t xml:space="preserve"> as a FILE pointer.</w:t>
+      </w:r>
+      <w:r>
+        <w:t xml:space="preserve"> </w:t>
       </w:r>
     </w:p>
     <w:p>
@@ -8803,12 +9452,63 @@
         <w:pStyle w:val="Heading6"/>
       </w:pPr>
       <w:r>
-        <w:t>stdin</w:t>
-      </w:r>
-    </w:p>
-    <w:p>
-      <w:r>
-        <w:t>standard input stream , can be used with putchar and getchar.</w:t>
+        <w:t>feof()</w:t>
+      </w:r>
+    </w:p>
+    <w:p>
+      <w:r>
+        <w:t>The feof function’s argument is a FILE pointer to the file to test for the end-of-file indicator—stdin in this case. The function returns a nonzero (true) value when the end-of-file indicator has been set; otherwise, the function returns zero (false). This program’s while statement continues executing until the user enters the end-of-file indicator.</w:t>
+      </w:r>
+    </w:p>
+    <w:p>
+      <w:pPr>
+        <w:rPr>
+          <w:rStyle w:val="Heading6Char"/>
+        </w:rPr>
+      </w:pPr>
+      <w:r>
+        <w:rPr>
+          <w:rStyle w:val="Heading6Char"/>
+        </w:rPr>
+        <w:t>fprint</w:t>
+      </w:r>
+      <w:r>
+        <w:rPr>
+          <w:rStyle w:val="Heading6Char"/>
+        </w:rPr>
+        <w:t>f()</w:t>
+      </w:r>
+    </w:p>
+    <w:p>
+      <w:r>
+        <w:t>Writes into the stream given to it’s first argumnent.</w:t>
+      </w:r>
+    </w:p>
+    <w:p>
+      <w:pPr>
+        <w:rPr>
+          <w:rStyle w:val="Heading6Char"/>
+        </w:rPr>
+      </w:pPr>
+      <w:r>
+        <w:rPr>
+          <w:rStyle w:val="Heading6Char"/>
+        </w:rPr>
+        <w:t>sprintf()</w:t>
+      </w:r>
+    </w:p>
+    <w:p>
+      <w:r>
+        <w:t>Print f but prefixed with a new first arg that</w:t>
+      </w:r>
+      <w:r>
+        <w:t xml:space="preserve"> acts as a</w:t>
+      </w:r>
+      <w:r>
+        <w:t>n output buffer for printf</w:t>
+      </w:r>
+      <w:r>
+        <w:t xml:space="preserve">. </w:t>
       </w:r>
     </w:p>
     <w:p>
@@ -8816,12 +9516,94 @@
         <w:pStyle w:val="Heading6"/>
       </w:pPr>
       <w:r>
-        <w:t>stdout</w:t>
-      </w:r>
-    </w:p>
-    <w:p>
-      <w:r>
-        <w:t>standard output steam.</w:t>
+        <w:t>malloc()</w:t>
+      </w:r>
+    </w:p>
+    <w:p>
+      <w:r>
+        <w:t>Takes the number of bytes to allocate</w:t>
+      </w:r>
+      <w:r>
+        <w:t xml:space="preserve"> and returns a void pointer to the chunk of array of the number of bytes it’s allocated.</w:t>
+      </w:r>
+      <w:r>
+        <w:t xml:space="preserve"> </w:t>
+      </w:r>
+      <w:r>
+        <w:t>It</w:t>
+      </w:r>
+      <w:r>
+        <w:t xml:space="preserve"> </w:t>
+      </w:r>
+      <w:r>
+        <w:t>i</w:t>
+      </w:r>
+      <w:r>
+        <w:t>s okay with the number being a variable</w:t>
+      </w:r>
+      <w:r>
+        <w:t>.</w:t>
+      </w:r>
+      <w:r>
+        <w:t>We typically mix i</w:t>
+      </w:r>
+      <w:r>
+        <w:t xml:space="preserve">t with the sizeof </w:t>
+      </w:r>
+      <w:r>
+        <w:t xml:space="preserve">function </w:t>
+      </w:r>
+      <w:r>
+        <w:t xml:space="preserve">and a pointer type casting so that </w:t>
+      </w:r>
+      <w:r>
+        <w:t>the memory is as much as needed and accessed accordingly as well</w:t>
+      </w:r>
+      <w:r>
+        <w:t>:</w:t>
+      </w:r>
+    </w:p>
+    <w:p>
+      <w:pPr>
+        <w:pStyle w:val="Code"/>
+      </w:pPr>
+      <w:r>
+        <w:lastRenderedPageBreak/>
+        <w:t>userdefinedtype*</w:t>
+      </w:r>
+      <w:r>
+        <w:t xml:space="preserve"> userdefinedPtr</w:t>
+      </w:r>
+      <w:r>
+        <w:t xml:space="preserve">= </w:t>
+      </w:r>
+      <w:r>
+        <w:t xml:space="preserve">(userdefinedtypename*) </w:t>
+      </w:r>
+      <w:r>
+        <w:t>malloc(sizeof(userdefinedtypename</w:t>
+      </w:r>
+      <w:r>
+        <w:t>*n</w:t>
+      </w:r>
+      <w:r>
+        <w:t>)</w:t>
+      </w:r>
+      <w:r>
+        <w:t>;</w:t>
+      </w:r>
+    </w:p>
+    <w:p>
+      <w:pPr>
+        <w:pStyle w:val="Code"/>
+      </w:pPr>
+    </w:p>
+    <w:p>
+      <w:pPr>
+        <w:pStyle w:val="Heading5"/>
+      </w:pPr>
+      <w:r>
+        <w:t>Error Reading</w:t>
       </w:r>
     </w:p>
     <w:p>
@@ -8829,41 +9611,15 @@
         <w:pStyle w:val="Heading6"/>
       </w:pPr>
       <w:r>
-        <w:t>fgetc</w:t>
-      </w:r>
-    </w:p>
-    <w:p>
-      <w:r>
-        <w:t xml:space="preserve">The function </w:t>
-      </w:r>
-      <w:r>
-        <w:rPr>
-          <w:b/>
-          <w:bCs/>
-          <w:u w:val="single"/>
-        </w:rPr>
-        <w:t>READS</w:t>
-      </w:r>
-      <w:r>
-        <w:t xml:space="preserve"> </w:t>
-      </w:r>
-      <w:r>
-        <w:t xml:space="preserve">a </w:t>
-      </w:r>
-      <w:r>
-        <w:t>character from</w:t>
-      </w:r>
-      <w:r>
-        <w:t xml:space="preserve"> </w:t>
-      </w:r>
-      <w:r>
-        <w:t>the</w:t>
-      </w:r>
-      <w:r>
-        <w:t xml:space="preserve"> file</w:t>
-      </w:r>
-      <w:r>
-        <w:t xml:space="preserve"> given to it as argument in the form of a pointer</w:t>
+        <w:t>The function is declared but not defined</w:t>
+      </w:r>
+    </w:p>
+    <w:p>
+      <w:r>
+        <w:t>Causes: Possible use of static function</w:t>
+      </w:r>
+      <w:r>
+        <w:t xml:space="preserve"> in a file other than the module.</w:t>
       </w:r>
     </w:p>
     <w:p>
@@ -8871,299 +9627,48 @@
         <w:pStyle w:val="Heading6"/>
       </w:pPr>
       <w:r>
-        <w:t>fputc</w:t>
-      </w:r>
-      <w:r>
-        <w:t>()</w:t>
-      </w:r>
-    </w:p>
-    <w:p>
-      <w:r>
-        <w:t>The function</w:t>
-      </w:r>
-      <w:r>
-        <w:t xml:space="preserve"> </w:t>
-      </w:r>
-      <w:r>
-        <w:rPr>
-          <w:b/>
-          <w:bCs/>
-          <w:u w:val="single"/>
-        </w:rPr>
-        <w:t>WRITES</w:t>
-      </w:r>
-      <w:r>
-        <w:t xml:space="preserve"> </w:t>
-      </w:r>
-      <w:r>
-        <w:t>the character in its first argument to the file specified by the FILE pointer in its second argument.</w:t>
-      </w:r>
-    </w:p>
-    <w:p>
-      <w:pPr>
-        <w:pStyle w:val="Heading6"/>
-      </w:pPr>
-      <w:r>
-        <w:t>fopen</w:t>
-      </w:r>
-      <w:r>
-        <w:t>()</w:t>
-      </w:r>
-    </w:p>
-    <w:p>
-      <w:r>
-        <w:t>The function is used to create a file</w:t>
-      </w:r>
-      <w:r>
-        <w:t xml:space="preserve"> with the name(extension included) of it’s first argument</w:t>
-      </w:r>
-      <w:r>
-        <w:t xml:space="preserve"> for the mode defined in it’s second argument</w:t>
+        <w:t xml:space="preserve">The argument in additional dependencies was supposed to be </w:t>
+      </w:r>
+      <w:r>
+        <w:t>Boolean</w:t>
+      </w:r>
+    </w:p>
+    <w:p>
+      <w:r>
+        <w:t>Possible spaced or ‘ ed naming while defining the dependencies</w:t>
       </w:r>
       <w:r>
         <w:t>.</w:t>
       </w:r>
-      <w:r>
-        <w:t xml:space="preserve"> </w:t>
-      </w:r>
-      <w:r>
-        <w:t>It</w:t>
-      </w:r>
-      <w:r>
-        <w:t xml:space="preserve"> returns the address of it</w:t>
-      </w:r>
-      <w:r>
-        <w:t xml:space="preserve"> as a FILE pointer.</w:t>
-      </w:r>
-      <w:r>
-        <w:t xml:space="preserve"> </w:t>
-      </w:r>
-    </w:p>
-    <w:p>
-      <w:pPr>
-        <w:pStyle w:val="Heading6"/>
-      </w:pPr>
-      <w:r>
-        <w:t>feof()</w:t>
-      </w:r>
-    </w:p>
-    <w:p>
-      <w:r>
-        <w:t xml:space="preserve">The feof function’s argument is a FILE pointer to the file to test for the end-of-file indicator—stdin in this case. The function returns a nonzero (true) value when the </w:t>
-      </w:r>
+    </w:p>
+    <w:p>
+      <w:pPr>
+        <w:pStyle w:val="Heading2"/>
+      </w:pPr>
+      <w:r>
+        <w:t>The C++ Programming</w:t>
+      </w:r>
+      <w:r>
+        <w:br/>
+      </w:r>
+      <w:r>
+        <w:t>Language</w:t>
+      </w:r>
+    </w:p>
+    <w:p>
+      <w:r>
+        <w:t>C++ is C with extra capabilities and headaches as well.</w:t>
+      </w:r>
+      <w:r>
+        <w:t xml:space="preserve"> Read the C language before this so that I can only focus on the C++ specific stuff here.</w:t>
+      </w:r>
+    </w:p>
+    <w:p>
+      <w:pPr>
+        <w:pStyle w:val="Heading5"/>
+      </w:pPr>
       <w:r>
         <w:lastRenderedPageBreak/>
-        <w:t>end-of-file indicator has been set; otherwise, the function returns zero (false). This program’s while statement continues executing until the user enters the end-of-file indicator.</w:t>
-      </w:r>
-    </w:p>
-    <w:p>
-      <w:pPr>
-        <w:rPr>
-          <w:rStyle w:val="Heading6Char"/>
-        </w:rPr>
-      </w:pPr>
-      <w:r>
-        <w:rPr>
-          <w:rStyle w:val="Heading6Char"/>
-        </w:rPr>
-        <w:t>fprint</w:t>
-      </w:r>
-      <w:r>
-        <w:rPr>
-          <w:rStyle w:val="Heading6Char"/>
-        </w:rPr>
-        <w:t>f()</w:t>
-      </w:r>
-    </w:p>
-    <w:p>
-      <w:r>
-        <w:t>Writes into the stream given to it’s first argumnent.</w:t>
-      </w:r>
-    </w:p>
-    <w:p>
-      <w:pPr>
-        <w:rPr>
-          <w:rStyle w:val="Heading6Char"/>
-        </w:rPr>
-      </w:pPr>
-      <w:r>
-        <w:rPr>
-          <w:rStyle w:val="Heading6Char"/>
-        </w:rPr>
-        <w:t>sprintf()</w:t>
-      </w:r>
-    </w:p>
-    <w:p>
-      <w:r>
-        <w:t>Print f but prefixed with a new first arg that</w:t>
-      </w:r>
-      <w:r>
-        <w:t xml:space="preserve"> acts as a</w:t>
-      </w:r>
-      <w:r>
-        <w:t>n output buffer for printf</w:t>
-      </w:r>
-      <w:r>
-        <w:t xml:space="preserve">. </w:t>
-      </w:r>
-    </w:p>
-    <w:p>
-      <w:pPr>
-        <w:pStyle w:val="Heading6"/>
-      </w:pPr>
-      <w:r>
-        <w:t>malloc()</w:t>
-      </w:r>
-    </w:p>
-    <w:p>
-      <w:r>
-        <w:t>Takes the number of bytes to allocate</w:t>
-      </w:r>
-      <w:r>
-        <w:t xml:space="preserve"> and returns a void pointer to the chunk of array of the number of bytes it’s allocated.</w:t>
-      </w:r>
-      <w:r>
-        <w:t xml:space="preserve"> </w:t>
-      </w:r>
-      <w:r>
-        <w:t>It</w:t>
-      </w:r>
-      <w:r>
-        <w:t xml:space="preserve"> </w:t>
-      </w:r>
-      <w:r>
-        <w:t>i</w:t>
-      </w:r>
-      <w:r>
-        <w:t>s okay with the number being a variable</w:t>
-      </w:r>
-      <w:r>
-        <w:t>.</w:t>
-      </w:r>
-      <w:r>
-        <w:t>We typically mix i</w:t>
-      </w:r>
-      <w:r>
-        <w:t xml:space="preserve">t with the sizeof </w:t>
-      </w:r>
-      <w:r>
-        <w:t xml:space="preserve">function </w:t>
-      </w:r>
-      <w:r>
-        <w:t xml:space="preserve">and a pointer type casting so that </w:t>
-      </w:r>
-      <w:r>
-        <w:t>the memory is as much as needed and accessed accordingly as well</w:t>
-      </w:r>
-      <w:r>
-        <w:t>:</w:t>
-      </w:r>
-    </w:p>
-    <w:p>
-      <w:pPr>
-        <w:pStyle w:val="Code"/>
-      </w:pPr>
-      <w:r>
-        <w:t>userdefinedtype*</w:t>
-      </w:r>
-      <w:r>
-        <w:t xml:space="preserve"> userdefinedPtr</w:t>
-      </w:r>
-      <w:r>
-        <w:t xml:space="preserve">= </w:t>
-      </w:r>
-      <w:r>
-        <w:t xml:space="preserve">(userdefinedtypename*) </w:t>
-      </w:r>
-      <w:r>
-        <w:t>malloc(sizeof(userdefinedtypename</w:t>
-      </w:r>
-      <w:r>
-        <w:t>*n</w:t>
-      </w:r>
-      <w:r>
-        <w:t>)</w:t>
-      </w:r>
-      <w:r>
-        <w:t>;</w:t>
-      </w:r>
-    </w:p>
-    <w:p>
-      <w:pPr>
-        <w:pStyle w:val="Code"/>
-      </w:pPr>
-    </w:p>
-    <w:p>
-      <w:pPr>
-        <w:pStyle w:val="Heading5"/>
-      </w:pPr>
-      <w:r>
-        <w:t>Error Reading</w:t>
-      </w:r>
-    </w:p>
-    <w:p>
-      <w:pPr>
-        <w:pStyle w:val="Heading6"/>
-      </w:pPr>
-      <w:r>
-        <w:t>The function is declared but not defined</w:t>
-      </w:r>
-    </w:p>
-    <w:p>
-      <w:r>
-        <w:t>Causes: Possible use of static function</w:t>
-      </w:r>
-      <w:r>
-        <w:t xml:space="preserve"> in a file other than the module.</w:t>
-      </w:r>
-    </w:p>
-    <w:p>
-      <w:pPr>
-        <w:pStyle w:val="Heading6"/>
-      </w:pPr>
-      <w:r>
-        <w:lastRenderedPageBreak/>
-        <w:t xml:space="preserve">The argument in additional dependencies was supposed to be </w:t>
-      </w:r>
-      <w:r>
-        <w:t>Boolean</w:t>
-      </w:r>
-    </w:p>
-    <w:p>
-      <w:r>
-        <w:t>Possible spaced or ‘ ed naming while defining the dependencies</w:t>
-      </w:r>
-      <w:r>
-        <w:t>.</w:t>
-      </w:r>
-    </w:p>
-    <w:p>
-      <w:pPr>
-        <w:pStyle w:val="Heading2"/>
-      </w:pPr>
-      <w:r>
-        <w:t>The C++ Programming</w:t>
-      </w:r>
-      <w:r>
-        <w:br/>
-      </w:r>
-      <w:r>
-        <w:t>Language</w:t>
-      </w:r>
-    </w:p>
-    <w:p>
-      <w:r>
-        <w:t>C++ is C with extra capabilities and headaches as well.</w:t>
-      </w:r>
-      <w:r>
-        <w:t xml:space="preserve"> Read the C language before this so that I can only focus on the C++ specific stuff here.</w:t>
-      </w:r>
-    </w:p>
-    <w:p>
-      <w:pPr>
-        <w:pStyle w:val="Heading5"/>
-      </w:pPr>
-      <w:r>
         <w:t>Classes</w:t>
       </w:r>
     </w:p>
@@ -9246,7 +9751,6 @@
         <w:pStyle w:val="Code"/>
       </w:pPr>
       <w:r>
-        <w:lastRenderedPageBreak/>
         <w:t>class classnam</w:t>
       </w:r>
       <w:r>
@@ -9355,6 +9859,7 @@
         <w:pStyle w:val="Code"/>
       </w:pPr>
       <w:r>
+        <w:lastRenderedPageBreak/>
         <w:t>{</w:t>
       </w:r>
     </w:p>
@@ -9476,7 +9981,6 @@
         <w:pStyle w:val="Code"/>
       </w:pPr>
       <w:r>
-        <w:lastRenderedPageBreak/>
         <w:t>classname instancename;</w:t>
       </w:r>
     </w:p>
@@ -9505,6 +10009,7 @@
         <w:pStyle w:val="Heading5"/>
       </w:pPr>
       <w:r>
+        <w:lastRenderedPageBreak/>
         <w:t>Constructors</w:t>
       </w:r>
     </w:p>
@@ -9723,7 +10228,6 @@
         <w:pStyle w:val="Heading6"/>
       </w:pPr>
       <w:r>
-        <w:lastRenderedPageBreak/>
         <w:t>Constructor Delegation</w:t>
       </w:r>
     </w:p>
@@ -9819,6 +10323,7 @@
         <w:rPr>
           <w:rStyle w:val="CodeChar"/>
         </w:rPr>
+        <w:lastRenderedPageBreak/>
         <w:t>constructorName(</w:t>
       </w:r>
       <w:r>
@@ -17534,10 +18039,7 @@
       </w:pPr>
       <w:r>
         <w:lastRenderedPageBreak/>
-        <w:t xml:space="preserve">Subject 3: </w:t>
-      </w:r>
-      <w:r>
-        <w:t>Operating Systems</w:t>
+        <w:t>Subject 3: Operating Systems</w:t>
       </w:r>
     </w:p>
     <w:p/>
@@ -17641,16 +18143,7 @@
         <w:pStyle w:val="Heading2"/>
       </w:pPr>
       <w:r>
-        <w:t xml:space="preserve">Chapter </w:t>
-      </w:r>
-      <w:r>
-        <w:t>2</w:t>
-      </w:r>
-      <w:r>
-        <w:t xml:space="preserve">: </w:t>
-      </w:r>
-      <w:r>
-        <w:t>PE</w:t>
+        <w:t>Chapter 2: PE</w:t>
       </w:r>
       <w:r>
         <w:t>/COFF</w:t>
@@ -17674,13 +18167,7 @@
       </w:pPr>
       <w:r>
         <w:lastRenderedPageBreak/>
-        <w:t xml:space="preserve">Chapter </w:t>
-      </w:r>
-      <w:r>
-        <w:t>3</w:t>
-      </w:r>
-      <w:r>
-        <w:t xml:space="preserve">: </w:t>
+        <w:t xml:space="preserve">Chapter 3: </w:t>
       </w:r>
       <w:r>
         <w:t>ZIP</w:t>
@@ -17703,16 +18190,7 @@
         <w:pStyle w:val="Heading2"/>
       </w:pPr>
       <w:r>
-        <w:t>Chapter 4</w:t>
-      </w:r>
-      <w:r>
-        <w:t xml:space="preserve">: </w:t>
-      </w:r>
-      <w:r>
-        <w:t>MPEG</w:t>
-      </w:r>
-      <w:r>
-        <w:t xml:space="preserve"> </w:t>
+        <w:t xml:space="preserve">Chapter 4: MPEG </w:t>
       </w:r>
       <w:r>
         <w:t>Family</w:t>
@@ -24888,7 +25366,6 @@
   <w:style w:type="character" w:default="1" w:styleId="DefaultParagraphFont">
     <w:name w:val="Default Paragraph Font"/>
     <w:uiPriority w:val="1"/>
-    <w:semiHidden/>
     <w:unhideWhenUsed/>
   </w:style>
   <w:style w:type="table" w:default="1" w:styleId="TableNormal">

</xml_diff>